<commit_message>
Docs as Code Phase 1 Update
</commit_message>
<xml_diff>
--- a/docs/LOHAShare_AI_Platform/01_Architecture_Governance/LOHAShare_AI_Platform_Document_Governance_and_Automation_Spec_v1.7_20260530.docx
+++ b/docs/LOHAShare_AI_Platform/01_Architecture_Governance/LOHAShare_AI_Platform_Document_Governance_and_Automation_Spec_v1.7_20260530.docx
@@ -25,34 +25,45 @@
           <w:szCs w:val="28"/>
           <w:lang w:eastAsia="zh-TW"/>
         </w:rPr>
-        <w:t>LOHAShare AI Platform Document Governance and Automation Spec v1.5</w:t>
+        <w:t>LOHAShare AI Platform Document Governance and Automation Spec v1.</w:t>
+      </w:r>
+      <w:r>
+        <w:rPr>
+          <w:rFonts w:cstheme="majorBidi" w:hint="eastAsia"/>
+          <w:b/>
+          <w:bCs/>
+          <w:color w:val="FF8405"/>
+          <w:sz w:val="32"/>
+          <w:szCs w:val="28"/>
+          <w:lang w:eastAsia="zh-TW"/>
+        </w:rPr>
+        <w:t>7</w:t>
       </w:r>
     </w:p>
     <w:p>
       <w:pPr>
-        <w:jc w:val="center"/>
         <w:rPr>
+          <w:rFonts w:ascii="Arial" w:eastAsia="微軟正黑體" w:hAnsi="Arial"/>
+          <w:sz w:val="22"/>
           <w:lang w:eastAsia="zh-TW"/>
         </w:rPr>
       </w:pPr>
+      <w:r>
+        <w:rPr>
+          <w:rFonts w:ascii="Arial" w:eastAsia="微軟正黑體" w:hAnsi="Arial" w:hint="eastAsia"/>
+          <w:sz w:val="22"/>
+          <w:lang w:eastAsia="zh-TW"/>
+        </w:rPr>
+        <w:t xml:space="preserve">v1.5 </w:t>
+      </w:r>
       <w:r>
         <w:rPr>
           <w:rFonts w:ascii="Arial" w:eastAsia="微軟正黑體" w:hAnsi="Arial"/>
           <w:sz w:val="22"/>
           <w:lang w:eastAsia="zh-TW"/>
         </w:rPr>
-        <w:t>文件治理與自動化產生規範</w:t>
+        <w:t>文件治理與自動化產生規範｜</w:t>
       </w:r>
-      <w:proofErr w:type="gramStart"/>
-      <w:r>
-        <w:rPr>
-          <w:rFonts w:ascii="Arial" w:eastAsia="微軟正黑體" w:hAnsi="Arial"/>
-          <w:sz w:val="22"/>
-          <w:lang w:eastAsia="zh-TW"/>
-        </w:rPr>
-        <w:t>｜</w:t>
-      </w:r>
-      <w:proofErr w:type="gramEnd"/>
       <w:r>
         <w:rPr>
           <w:rFonts w:ascii="Arial" w:eastAsia="微軟正黑體" w:hAnsi="Arial"/>
@@ -61,13 +72,86 @@
         </w:rPr>
         <w:t>2026-05-30</w:t>
       </w:r>
-    </w:p>
-    <w:p>
-      <w:pPr>
+      <w:r>
         <w:rPr>
+          <w:rFonts w:ascii="Arial" w:eastAsia="微軟正黑體" w:hAnsi="Arial"/>
+          <w:sz w:val="22"/>
           <w:lang w:eastAsia="zh-TW"/>
         </w:rPr>
-      </w:pPr>
+        <w:br/>
+      </w:r>
+      <w:r>
+        <w:rPr>
+          <w:rFonts w:ascii="Arial" w:eastAsia="微軟正黑體" w:hAnsi="Arial" w:hint="eastAsia"/>
+          <w:sz w:val="22"/>
+          <w:lang w:eastAsia="zh-TW"/>
+        </w:rPr>
+        <w:t xml:space="preserve">v1.6 </w:t>
+      </w:r>
+      <w:r>
+        <w:rPr>
+          <w:rFonts w:ascii="Arial" w:eastAsia="微軟正黑體" w:hAnsi="Arial"/>
+          <w:sz w:val="22"/>
+          <w:lang w:eastAsia="zh-TW"/>
+        </w:rPr>
+        <w:t>新增</w:t>
+      </w:r>
+      <w:r>
+        <w:rPr>
+          <w:rFonts w:ascii="Arial" w:eastAsia="微軟正黑體" w:hAnsi="Arial" w:hint="eastAsia"/>
+          <w:sz w:val="22"/>
+          <w:lang w:eastAsia="zh-TW"/>
+        </w:rPr>
+        <w:t xml:space="preserve"> </w:t>
+      </w:r>
+      <w:r>
+        <w:rPr>
+          <w:rFonts w:ascii="Arial" w:eastAsia="微軟正黑體" w:hAnsi="Arial"/>
+          <w:sz w:val="22"/>
+          <w:lang w:eastAsia="zh-TW"/>
+        </w:rPr>
+        <w:t>命名層級同步規則</w:t>
+      </w:r>
+      <w:r>
+        <w:rPr>
+          <w:rFonts w:ascii="Arial" w:eastAsia="微軟正黑體" w:hAnsi="Arial"/>
+          <w:sz w:val="22"/>
+          <w:lang w:eastAsia="zh-TW"/>
+        </w:rPr>
+        <w:br/>
+      </w:r>
+      <w:r>
+        <w:rPr>
+          <w:rFonts w:ascii="Arial" w:eastAsia="微軟正黑體" w:hAnsi="Arial" w:hint="eastAsia"/>
+          <w:sz w:val="22"/>
+          <w:lang w:eastAsia="zh-TW"/>
+        </w:rPr>
+        <w:t xml:space="preserve">v1.7 </w:t>
+      </w:r>
+      <w:r>
+        <w:rPr>
+          <w:rFonts w:ascii="Arial" w:eastAsia="微軟正黑體" w:hAnsi="Arial"/>
+          <w:sz w:val="22"/>
+          <w:lang w:eastAsia="zh-TW"/>
+        </w:rPr>
+        <w:t>新增</w:t>
+      </w:r>
+      <w:r>
+        <w:rPr>
+          <w:rFonts w:ascii="Arial" w:eastAsia="微軟正黑體" w:hAnsi="Arial"/>
+          <w:sz w:val="22"/>
+          <w:lang w:eastAsia="zh-TW"/>
+        </w:rPr>
+        <w:t xml:space="preserve"> GitHub / Dropbox </w:t>
+      </w:r>
+      <w:r>
+        <w:rPr>
+          <w:rFonts w:ascii="Arial" w:eastAsia="微軟正黑體" w:hAnsi="Arial"/>
+          <w:sz w:val="22"/>
+          <w:lang w:eastAsia="zh-TW"/>
+        </w:rPr>
+        <w:t>雙軌同步治理原則</w:t>
+      </w:r>
     </w:p>
     <w:p>
       <w:pPr>
@@ -90,19 +174,8 @@
           <w:sz w:val="26"/>
           <w:szCs w:val="26"/>
         </w:rPr>
-        <w:t xml:space="preserve">v1.5 </w:t>
+        <w:t>v1.5 更新目的</w:t>
       </w:r>
-      <w:proofErr w:type="spellStart"/>
-      <w:r>
-        <w:rPr>
-          <w:rFonts w:ascii="Noto Sans TC" w:eastAsia="Noto Sans TC" w:hAnsi="Noto Sans TC"/>
-          <w:color w:val="FF8405"/>
-          <w:sz w:val="26"/>
-          <w:szCs w:val="26"/>
-        </w:rPr>
-        <w:t>更新目的</w:t>
-      </w:r>
-      <w:proofErr w:type="spellEnd"/>
     </w:p>
     <w:p>
       <w:r>
@@ -869,7 +942,6 @@
           <w:szCs w:val="26"/>
         </w:rPr>
       </w:pPr>
-      <w:proofErr w:type="spellStart"/>
       <w:r>
         <w:rPr>
           <w:rFonts w:ascii="Noto Sans TC" w:eastAsia="Noto Sans TC" w:hAnsi="Noto Sans TC"/>
@@ -879,7 +951,6 @@
         </w:rPr>
         <w:t>更新</w:t>
       </w:r>
-      <w:proofErr w:type="spellEnd"/>
       <w:r>
         <w:rPr>
           <w:rFonts w:ascii="Noto Sans TC" w:eastAsia="Noto Sans TC" w:hAnsi="Noto Sans TC" w:hint="eastAsia"/>
@@ -892,13 +963,8 @@
       </w:r>
     </w:p>
     <w:p>
-      <w:proofErr w:type="spellStart"/>
       <w:r>
-        <w:t>修正先前部分文件中把</w:t>
-      </w:r>
-      <w:proofErr w:type="spellEnd"/>
-      <w:r>
-        <w:t xml:space="preserve"> Nexus Lead Ops 或 Lead &amp; Notification Console 寫得過於接近「產品母體」的語境，正式確認其在主 PRD 底下的層級定位。</w:t>
+        <w:t>修正先前部分文件中把 Nexus Lead Ops 或 Lead &amp; Notification Console 寫得過於接近「產品母體」的語境，正式確認其在主 PRD 底下的層級定位。</w:t>
       </w:r>
     </w:p>
     <w:p>
@@ -950,47 +1016,13 @@
       <w:pPr>
         <w:jc w:val="center"/>
       </w:pPr>
-      <w:proofErr w:type="spellStart"/>
       <w:r>
         <w:rPr>
           <w:color w:val="666666"/>
           <w:sz w:val="18"/>
         </w:rPr>
-        <w:t>圖</w:t>
+        <w:t>圖：LOHAShare AI Platform 命名層級架構圖</w:t>
       </w:r>
-      <w:proofErr w:type="spellEnd"/>
-      <w:r>
-        <w:rPr>
-          <w:color w:val="666666"/>
-          <w:sz w:val="18"/>
-        </w:rPr>
-        <w:t>：</w:t>
-      </w:r>
-      <w:proofErr w:type="spellStart"/>
-      <w:r>
-        <w:rPr>
-          <w:color w:val="666666"/>
-          <w:sz w:val="18"/>
-        </w:rPr>
-        <w:t>LOHAShare</w:t>
-      </w:r>
-      <w:proofErr w:type="spellEnd"/>
-      <w:r>
-        <w:rPr>
-          <w:color w:val="666666"/>
-          <w:sz w:val="18"/>
-        </w:rPr>
-        <w:t xml:space="preserve"> AI Platform </w:t>
-      </w:r>
-      <w:proofErr w:type="spellStart"/>
-      <w:r>
-        <w:rPr>
-          <w:color w:val="666666"/>
-          <w:sz w:val="18"/>
-        </w:rPr>
-        <w:t>命名層級架構圖</w:t>
-      </w:r>
-      <w:proofErr w:type="spellEnd"/>
     </w:p>
     <w:p>
       <w:pPr>
@@ -1006,7 +1038,6 @@
           <w:szCs w:val="26"/>
         </w:rPr>
       </w:pPr>
-      <w:proofErr w:type="spellStart"/>
       <w:r>
         <w:rPr>
           <w:rFonts w:ascii="Noto Sans TC" w:eastAsia="Noto Sans TC" w:hAnsi="Noto Sans TC"/>
@@ -1016,7 +1047,6 @@
         </w:rPr>
         <w:t>正式命名層級</w:t>
       </w:r>
-      <w:proofErr w:type="spellEnd"/>
     </w:p>
     <w:tbl>
       <w:tblPr>
@@ -1050,7 +1080,6 @@
             <w:pPr>
               <w:jc w:val="center"/>
             </w:pPr>
-            <w:proofErr w:type="spellStart"/>
             <w:r>
               <w:rPr>
                 <w:b/>
@@ -1058,7 +1087,6 @@
               </w:rPr>
               <w:t>層級</w:t>
             </w:r>
-            <w:proofErr w:type="spellEnd"/>
           </w:p>
         </w:tc>
         <w:tc>
@@ -1454,7 +1482,6 @@
           <w:color w:val="FF8405"/>
         </w:rPr>
       </w:pPr>
-      <w:proofErr w:type="spellStart"/>
       <w:r>
         <w:rPr>
           <w:rFonts w:ascii="Noto Sans TC" w:eastAsia="Noto Sans TC" w:hAnsi="Noto Sans TC"/>
@@ -1462,7 +1489,6 @@
         </w:rPr>
         <w:t>本次修正後的核心規則</w:t>
       </w:r>
-      <w:proofErr w:type="spellEnd"/>
     </w:p>
     <w:p>
       <w:r>
@@ -1554,16 +1580,7 @@
           <w:color w:val="FF8405"/>
           <w:sz w:val="32"/>
         </w:rPr>
-        <w:t xml:space="preserve"> </w:t>
-      </w:r>
-      <w:proofErr w:type="spellStart"/>
-      <w:r>
-        <w:rPr>
-          <w:b/>
-          <w:color w:val="FF8405"/>
-          <w:sz w:val="32"/>
-        </w:rPr>
-        <w:t>增補：</w:t>
+        <w:t xml:space="preserve"> 增補：</w:t>
       </w:r>
       <w:r>
         <w:rPr>
@@ -1571,27 +1588,8 @@
           <w:color w:val="FF8405"/>
           <w:sz w:val="32"/>
         </w:rPr>
-        <w:t>新增</w:t>
+        <w:t>新增 GitHub / Dropbox 雙軌同步治理原則</w:t>
       </w:r>
-      <w:proofErr w:type="spellEnd"/>
-      <w:r>
-        <w:rPr>
-          <w:b/>
-          <w:color w:val="FF8405"/>
-          <w:sz w:val="32"/>
-        </w:rPr>
-        <w:t xml:space="preserve"> GitHub / Dropbox </w:t>
-      </w:r>
-      <w:proofErr w:type="spellStart"/>
-      <w:r>
-        <w:rPr>
-          <w:b/>
-          <w:color w:val="FF8405"/>
-          <w:sz w:val="32"/>
-        </w:rPr>
-        <w:t>雙軌同步治理原則</w:t>
-      </w:r>
-      <w:proofErr w:type="spellEnd"/>
     </w:p>
     <w:p>
       <w:pPr>
@@ -1625,42 +1623,12 @@
           <w:lang w:eastAsia="zh-TW"/>
         </w:rPr>
       </w:pPr>
-      <w:proofErr w:type="spellStart"/>
       <w:r>
         <w:rPr>
           <w:rFonts w:ascii="微軟正黑體" w:eastAsia="微軟正黑體" w:hAnsi="微軟正黑體"/>
         </w:rPr>
-        <w:t>新增</w:t>
+        <w:t>新增 GitHub / Dropbox 雙軌同步策略，避免 Local PC、GitHub、Dropbox、ChatGPT、n8n、Replit scripts 等來源各自形成不同版本</w:t>
       </w:r>
-      <w:proofErr w:type="spellEnd"/>
-      <w:r>
-        <w:rPr>
-          <w:rFonts w:ascii="微軟正黑體" w:eastAsia="微軟正黑體" w:hAnsi="微軟正黑體"/>
-        </w:rPr>
-        <w:t xml:space="preserve"> GitHub / Dropbox </w:t>
-      </w:r>
-      <w:proofErr w:type="spellStart"/>
-      <w:r>
-        <w:rPr>
-          <w:rFonts w:ascii="微軟正黑體" w:eastAsia="微軟正黑體" w:hAnsi="微軟正黑體"/>
-        </w:rPr>
-        <w:t>雙軌同步策略，避免</w:t>
-      </w:r>
-      <w:proofErr w:type="spellEnd"/>
-      <w:r>
-        <w:rPr>
-          <w:rFonts w:ascii="微軟正黑體" w:eastAsia="微軟正黑體" w:hAnsi="微軟正黑體"/>
-        </w:rPr>
-        <w:t xml:space="preserve"> Local PC、GitHub、Dropbox、ChatGPT、n8n、Replit scripts </w:t>
-      </w:r>
-      <w:proofErr w:type="spellStart"/>
-      <w:r>
-        <w:rPr>
-          <w:rFonts w:ascii="微軟正黑體" w:eastAsia="微軟正黑體" w:hAnsi="微軟正黑體"/>
-        </w:rPr>
-        <w:t>等來源各自形成不同版本</w:t>
-      </w:r>
-      <w:proofErr w:type="spellEnd"/>
     </w:p>
     <w:p>
       <w:pPr>
@@ -1683,7 +1651,6 @@
         <w:lastRenderedPageBreak/>
         <w:t xml:space="preserve">2. </w:t>
       </w:r>
-      <w:proofErr w:type="spellStart"/>
       <w:r>
         <w:rPr>
           <w:rFonts w:ascii="Noto Sans TC" w:eastAsia="Noto Sans TC" w:hAnsi="Noto Sans TC"/>
@@ -1691,9 +1658,91 @@
           <w:sz w:val="26"/>
           <w:szCs w:val="26"/>
         </w:rPr>
-        <w:t>本次</w:t>
+        <w:t>本次 v1.7 更新重點</w:t>
       </w:r>
-      <w:proofErr w:type="spellEnd"/>
+    </w:p>
+    <w:p>
+      <w:pPr>
+        <w:pStyle w:val="a0"/>
+      </w:pPr>
+      <w:r>
+        <w:rPr>
+          <w:rFonts w:ascii="微軟正黑體" w:eastAsia="微軟正黑體" w:hAnsi="微軟正黑體"/>
+          <w:sz w:val="20"/>
+        </w:rPr>
+        <w:t>新增 GitHub = Working Source of Truth 的正式規則。</w:t>
+      </w:r>
+    </w:p>
+    <w:p>
+      <w:pPr>
+        <w:pStyle w:val="a0"/>
+      </w:pPr>
+      <w:r>
+        <w:rPr>
+          <w:rFonts w:ascii="微軟正黑體" w:eastAsia="微軟正黑體" w:hAnsi="微軟正黑體"/>
+          <w:sz w:val="20"/>
+        </w:rPr>
+        <w:t>新增 Dropbox = Formal Archive / Distribution Copy 的正式規則。</w:t>
+      </w:r>
+    </w:p>
+    <w:p>
+      <w:pPr>
+        <w:pStyle w:val="a0"/>
+      </w:pPr>
+      <w:r>
+        <w:rPr>
+          <w:rFonts w:ascii="微軟正黑體" w:eastAsia="微軟正黑體" w:hAnsi="微軟正黑體"/>
+          <w:sz w:val="20"/>
+        </w:rPr>
+        <w:t>明確規定 GitHub clone 資料夾不建議直接放在 Dropbox 同步資料夾內。</w:t>
+      </w:r>
+    </w:p>
+    <w:p>
+      <w:pPr>
+        <w:pStyle w:val="a0"/>
+      </w:pPr>
+      <w:r>
+        <w:rPr>
+          <w:rFonts w:ascii="微軟正黑體" w:eastAsia="微軟正黑體" w:hAnsi="微軟正黑體"/>
+          <w:sz w:val="20"/>
+        </w:rPr>
+        <w:t>新增 Local PC / GitHub Desktop / Dropbox / ChatGPT 協作資料來源優先順序。</w:t>
+      </w:r>
+    </w:p>
+    <w:p>
+      <w:pPr>
+        <w:pStyle w:val="a0"/>
+      </w:pPr>
+      <w:r>
+        <w:rPr>
+          <w:rFonts w:ascii="微軟正黑體" w:eastAsia="微軟正黑體" w:hAnsi="微軟正黑體"/>
+          <w:sz w:val="20"/>
+        </w:rPr>
+        <w:t>補強 n8n、scripts、Prompt 產生文件時必須依 GitHub 工作基準與 Current Folder Structure 執行。</w:t>
+      </w:r>
+    </w:p>
+    <w:p>
+      <w:pPr>
+        <w:pStyle w:val="a0"/>
+      </w:pPr>
+      <w:r>
+        <w:rPr>
+          <w:rFonts w:ascii="微軟正黑體" w:eastAsia="微軟正黑體" w:hAnsi="微軟正黑體"/>
+          <w:sz w:val="20"/>
+        </w:rPr>
+        <w:t>保留所有自動產出文件預設為 Draft Generated，必須人工審核後才可成為 Stable。</w:t>
+      </w:r>
+    </w:p>
+    <w:p>
+      <w:pPr>
+        <w:pStyle w:val="1"/>
+        <w:rPr>
+          <w:rFonts w:ascii="Noto Sans TC" w:eastAsia="Noto Sans TC" w:hAnsi="Noto Sans TC"/>
+          <w:color w:val="FF8405"/>
+          <w:sz w:val="26"/>
+          <w:szCs w:val="26"/>
+        </w:rPr>
+      </w:pPr>
       <w:r>
         <w:rPr>
           <w:rFonts w:ascii="Noto Sans TC" w:eastAsia="Noto Sans TC" w:hAnsi="Noto Sans TC"/>
@@ -1701,320 +1750,8 @@
           <w:sz w:val="26"/>
           <w:szCs w:val="26"/>
         </w:rPr>
-        <w:t xml:space="preserve"> v1.7 </w:t>
+        <w:t>3. GitHub / Dropbox 雙軌治理原則</w:t>
       </w:r>
-      <w:proofErr w:type="spellStart"/>
-      <w:r>
-        <w:rPr>
-          <w:rFonts w:ascii="Noto Sans TC" w:eastAsia="Noto Sans TC" w:hAnsi="Noto Sans TC"/>
-          <w:color w:val="FF8405"/>
-          <w:sz w:val="26"/>
-          <w:szCs w:val="26"/>
-        </w:rPr>
-        <w:t>更新重點</w:t>
-      </w:r>
-      <w:proofErr w:type="spellEnd"/>
-    </w:p>
-    <w:p>
-      <w:pPr>
-        <w:pStyle w:val="a0"/>
-      </w:pPr>
-      <w:proofErr w:type="spellStart"/>
-      <w:r>
-        <w:rPr>
-          <w:rFonts w:ascii="微軟正黑體" w:eastAsia="微軟正黑體" w:hAnsi="微軟正黑體"/>
-          <w:sz w:val="20"/>
-        </w:rPr>
-        <w:t>新增</w:t>
-      </w:r>
-      <w:proofErr w:type="spellEnd"/>
-      <w:r>
-        <w:rPr>
-          <w:rFonts w:ascii="微軟正黑體" w:eastAsia="微軟正黑體" w:hAnsi="微軟正黑體"/>
-          <w:sz w:val="20"/>
-        </w:rPr>
-        <w:t xml:space="preserve"> GitHub = Working Source of Truth </w:t>
-      </w:r>
-      <w:proofErr w:type="spellStart"/>
-      <w:r>
-        <w:rPr>
-          <w:rFonts w:ascii="微軟正黑體" w:eastAsia="微軟正黑體" w:hAnsi="微軟正黑體"/>
-          <w:sz w:val="20"/>
-        </w:rPr>
-        <w:t>的正式規則</w:t>
-      </w:r>
-      <w:proofErr w:type="spellEnd"/>
-      <w:r>
-        <w:rPr>
-          <w:rFonts w:ascii="微軟正黑體" w:eastAsia="微軟正黑體" w:hAnsi="微軟正黑體"/>
-          <w:sz w:val="20"/>
-        </w:rPr>
-        <w:t>。</w:t>
-      </w:r>
-    </w:p>
-    <w:p>
-      <w:pPr>
-        <w:pStyle w:val="a0"/>
-      </w:pPr>
-      <w:proofErr w:type="spellStart"/>
-      <w:r>
-        <w:rPr>
-          <w:rFonts w:ascii="微軟正黑體" w:eastAsia="微軟正黑體" w:hAnsi="微軟正黑體"/>
-          <w:sz w:val="20"/>
-        </w:rPr>
-        <w:t>新增</w:t>
-      </w:r>
-      <w:proofErr w:type="spellEnd"/>
-      <w:r>
-        <w:rPr>
-          <w:rFonts w:ascii="微軟正黑體" w:eastAsia="微軟正黑體" w:hAnsi="微軟正黑體"/>
-          <w:sz w:val="20"/>
-        </w:rPr>
-        <w:t xml:space="preserve"> Dropbox = Formal Archive / Distribution Copy </w:t>
-      </w:r>
-      <w:proofErr w:type="spellStart"/>
-      <w:r>
-        <w:rPr>
-          <w:rFonts w:ascii="微軟正黑體" w:eastAsia="微軟正黑體" w:hAnsi="微軟正黑體"/>
-          <w:sz w:val="20"/>
-        </w:rPr>
-        <w:t>的正式規則</w:t>
-      </w:r>
-      <w:proofErr w:type="spellEnd"/>
-      <w:r>
-        <w:rPr>
-          <w:rFonts w:ascii="微軟正黑體" w:eastAsia="微軟正黑體" w:hAnsi="微軟正黑體"/>
-          <w:sz w:val="20"/>
-        </w:rPr>
-        <w:t>。</w:t>
-      </w:r>
-    </w:p>
-    <w:p>
-      <w:pPr>
-        <w:pStyle w:val="a0"/>
-      </w:pPr>
-      <w:proofErr w:type="spellStart"/>
-      <w:r>
-        <w:rPr>
-          <w:rFonts w:ascii="微軟正黑體" w:eastAsia="微軟正黑體" w:hAnsi="微軟正黑體"/>
-          <w:sz w:val="20"/>
-        </w:rPr>
-        <w:t>明確規定</w:t>
-      </w:r>
-      <w:proofErr w:type="spellEnd"/>
-      <w:r>
-        <w:rPr>
-          <w:rFonts w:ascii="微軟正黑體" w:eastAsia="微軟正黑體" w:hAnsi="微軟正黑體"/>
-          <w:sz w:val="20"/>
-        </w:rPr>
-        <w:t xml:space="preserve"> GitHub clone </w:t>
-      </w:r>
-      <w:proofErr w:type="spellStart"/>
-      <w:r>
-        <w:rPr>
-          <w:rFonts w:ascii="微軟正黑體" w:eastAsia="微軟正黑體" w:hAnsi="微軟正黑體"/>
-          <w:sz w:val="20"/>
-        </w:rPr>
-        <w:t>資料夾不建議直接放在</w:t>
-      </w:r>
-      <w:proofErr w:type="spellEnd"/>
-      <w:r>
-        <w:rPr>
-          <w:rFonts w:ascii="微軟正黑體" w:eastAsia="微軟正黑體" w:hAnsi="微軟正黑體"/>
-          <w:sz w:val="20"/>
-        </w:rPr>
-        <w:t xml:space="preserve"> Dropbox </w:t>
-      </w:r>
-      <w:proofErr w:type="spellStart"/>
-      <w:r>
-        <w:rPr>
-          <w:rFonts w:ascii="微軟正黑體" w:eastAsia="微軟正黑體" w:hAnsi="微軟正黑體"/>
-          <w:sz w:val="20"/>
-        </w:rPr>
-        <w:t>同步資料夾內</w:t>
-      </w:r>
-      <w:proofErr w:type="spellEnd"/>
-      <w:r>
-        <w:rPr>
-          <w:rFonts w:ascii="微軟正黑體" w:eastAsia="微軟正黑體" w:hAnsi="微軟正黑體"/>
-          <w:sz w:val="20"/>
-        </w:rPr>
-        <w:t>。</w:t>
-      </w:r>
-    </w:p>
-    <w:p>
-      <w:pPr>
-        <w:pStyle w:val="a0"/>
-      </w:pPr>
-      <w:proofErr w:type="spellStart"/>
-      <w:r>
-        <w:rPr>
-          <w:rFonts w:ascii="微軟正黑體" w:eastAsia="微軟正黑體" w:hAnsi="微軟正黑體"/>
-          <w:sz w:val="20"/>
-        </w:rPr>
-        <w:t>新增</w:t>
-      </w:r>
-      <w:proofErr w:type="spellEnd"/>
-      <w:r>
-        <w:rPr>
-          <w:rFonts w:ascii="微軟正黑體" w:eastAsia="微軟正黑體" w:hAnsi="微軟正黑體"/>
-          <w:sz w:val="20"/>
-        </w:rPr>
-        <w:t xml:space="preserve"> Local PC / GitHub Desktop / Dropbox / ChatGPT </w:t>
-      </w:r>
-      <w:proofErr w:type="spellStart"/>
-      <w:r>
-        <w:rPr>
-          <w:rFonts w:ascii="微軟正黑體" w:eastAsia="微軟正黑體" w:hAnsi="微軟正黑體"/>
-          <w:sz w:val="20"/>
-        </w:rPr>
-        <w:t>協作資料來源優先順序</w:t>
-      </w:r>
-      <w:proofErr w:type="spellEnd"/>
-      <w:r>
-        <w:rPr>
-          <w:rFonts w:ascii="微軟正黑體" w:eastAsia="微軟正黑體" w:hAnsi="微軟正黑體"/>
-          <w:sz w:val="20"/>
-        </w:rPr>
-        <w:t>。</w:t>
-      </w:r>
-    </w:p>
-    <w:p>
-      <w:pPr>
-        <w:pStyle w:val="a0"/>
-      </w:pPr>
-      <w:proofErr w:type="spellStart"/>
-      <w:r>
-        <w:rPr>
-          <w:rFonts w:ascii="微軟正黑體" w:eastAsia="微軟正黑體" w:hAnsi="微軟正黑體"/>
-          <w:sz w:val="20"/>
-        </w:rPr>
-        <w:t>補強</w:t>
-      </w:r>
-      <w:proofErr w:type="spellEnd"/>
-      <w:r>
-        <w:rPr>
-          <w:rFonts w:ascii="微軟正黑體" w:eastAsia="微軟正黑體" w:hAnsi="微軟正黑體"/>
-          <w:sz w:val="20"/>
-        </w:rPr>
-        <w:t xml:space="preserve"> n8n、scripts、Prompt </w:t>
-      </w:r>
-      <w:proofErr w:type="spellStart"/>
-      <w:r>
-        <w:rPr>
-          <w:rFonts w:ascii="微軟正黑體" w:eastAsia="微軟正黑體" w:hAnsi="微軟正黑體"/>
-          <w:sz w:val="20"/>
-        </w:rPr>
-        <w:t>產生文件時必須依</w:t>
-      </w:r>
-      <w:proofErr w:type="spellEnd"/>
-      <w:r>
-        <w:rPr>
-          <w:rFonts w:ascii="微軟正黑體" w:eastAsia="微軟正黑體" w:hAnsi="微軟正黑體"/>
-          <w:sz w:val="20"/>
-        </w:rPr>
-        <w:t xml:space="preserve"> GitHub </w:t>
-      </w:r>
-      <w:proofErr w:type="spellStart"/>
-      <w:r>
-        <w:rPr>
-          <w:rFonts w:ascii="微軟正黑體" w:eastAsia="微軟正黑體" w:hAnsi="微軟正黑體"/>
-          <w:sz w:val="20"/>
-        </w:rPr>
-        <w:t>工作基準與</w:t>
-      </w:r>
-      <w:proofErr w:type="spellEnd"/>
-      <w:r>
-        <w:rPr>
-          <w:rFonts w:ascii="微軟正黑體" w:eastAsia="微軟正黑體" w:hAnsi="微軟正黑體"/>
-          <w:sz w:val="20"/>
-        </w:rPr>
-        <w:t xml:space="preserve"> Current Folder Structure </w:t>
-      </w:r>
-      <w:proofErr w:type="spellStart"/>
-      <w:r>
-        <w:rPr>
-          <w:rFonts w:ascii="微軟正黑體" w:eastAsia="微軟正黑體" w:hAnsi="微軟正黑體"/>
-          <w:sz w:val="20"/>
-        </w:rPr>
-        <w:t>執行</w:t>
-      </w:r>
-      <w:proofErr w:type="spellEnd"/>
-      <w:r>
-        <w:rPr>
-          <w:rFonts w:ascii="微軟正黑體" w:eastAsia="微軟正黑體" w:hAnsi="微軟正黑體"/>
-          <w:sz w:val="20"/>
-        </w:rPr>
-        <w:t>。</w:t>
-      </w:r>
-    </w:p>
-    <w:p>
-      <w:pPr>
-        <w:pStyle w:val="a0"/>
-      </w:pPr>
-      <w:proofErr w:type="spellStart"/>
-      <w:r>
-        <w:rPr>
-          <w:rFonts w:ascii="微軟正黑體" w:eastAsia="微軟正黑體" w:hAnsi="微軟正黑體"/>
-          <w:sz w:val="20"/>
-        </w:rPr>
-        <w:t>保留所有自動產出文件預設為</w:t>
-      </w:r>
-      <w:proofErr w:type="spellEnd"/>
-      <w:r>
-        <w:rPr>
-          <w:rFonts w:ascii="微軟正黑體" w:eastAsia="微軟正黑體" w:hAnsi="微軟正黑體"/>
-          <w:sz w:val="20"/>
-        </w:rPr>
-        <w:t xml:space="preserve"> Draft </w:t>
-      </w:r>
-      <w:proofErr w:type="spellStart"/>
-      <w:r>
-        <w:rPr>
-          <w:rFonts w:ascii="微軟正黑體" w:eastAsia="微軟正黑體" w:hAnsi="微軟正黑體"/>
-          <w:sz w:val="20"/>
-        </w:rPr>
-        <w:t>Generated，必須人工審核後才可成為</w:t>
-      </w:r>
-      <w:proofErr w:type="spellEnd"/>
-      <w:r>
-        <w:rPr>
-          <w:rFonts w:ascii="微軟正黑體" w:eastAsia="微軟正黑體" w:hAnsi="微軟正黑體"/>
-          <w:sz w:val="20"/>
-        </w:rPr>
-        <w:t xml:space="preserve"> Stable。</w:t>
-      </w:r>
-    </w:p>
-    <w:p>
-      <w:pPr>
-        <w:pStyle w:val="1"/>
-        <w:rPr>
-          <w:rFonts w:ascii="Noto Sans TC" w:eastAsia="Noto Sans TC" w:hAnsi="Noto Sans TC"/>
-          <w:color w:val="FF8405"/>
-          <w:sz w:val="26"/>
-          <w:szCs w:val="26"/>
-        </w:rPr>
-      </w:pPr>
-      <w:r>
-        <w:rPr>
-          <w:rFonts w:ascii="Noto Sans TC" w:eastAsia="Noto Sans TC" w:hAnsi="Noto Sans TC"/>
-          <w:color w:val="FF8405"/>
-          <w:sz w:val="26"/>
-          <w:szCs w:val="26"/>
-        </w:rPr>
-        <w:t xml:space="preserve">3. GitHub / Dropbox </w:t>
-      </w:r>
-      <w:proofErr w:type="spellStart"/>
-      <w:r>
-        <w:rPr>
-          <w:rFonts w:ascii="Noto Sans TC" w:eastAsia="Noto Sans TC" w:hAnsi="Noto Sans TC"/>
-          <w:color w:val="FF8405"/>
-          <w:sz w:val="26"/>
-          <w:szCs w:val="26"/>
-        </w:rPr>
-        <w:t>雙軌治理原則</w:t>
-      </w:r>
-      <w:proofErr w:type="spellEnd"/>
     </w:p>
     <w:tbl>
       <w:tblPr>
@@ -2047,7 +1784,6 @@
             <w:vAlign w:val="center"/>
           </w:tcPr>
           <w:p>
-            <w:proofErr w:type="spellStart"/>
             <w:r>
               <w:rPr>
                 <w:rFonts w:ascii="微軟正黑體" w:eastAsia="微軟正黑體" w:hAnsi="微軟正黑體"/>
@@ -2057,7 +1793,6 @@
               </w:rPr>
               <w:t>位置</w:t>
             </w:r>
-            <w:proofErr w:type="spellEnd"/>
           </w:p>
         </w:tc>
         <w:tc>
@@ -2067,7 +1802,6 @@
             <w:vAlign w:val="center"/>
           </w:tcPr>
           <w:p>
-            <w:proofErr w:type="spellStart"/>
             <w:r>
               <w:rPr>
                 <w:rFonts w:ascii="微軟正黑體" w:eastAsia="微軟正黑體" w:hAnsi="微軟正黑體"/>
@@ -2077,7 +1811,6 @@
               </w:rPr>
               <w:t>治理定位</w:t>
             </w:r>
-            <w:proofErr w:type="spellEnd"/>
           </w:p>
         </w:tc>
         <w:tc>
@@ -2087,7 +1820,6 @@
             <w:vAlign w:val="center"/>
           </w:tcPr>
           <w:p>
-            <w:proofErr w:type="spellStart"/>
             <w:r>
               <w:rPr>
                 <w:rFonts w:ascii="微軟正黑體" w:eastAsia="微軟正黑體" w:hAnsi="微軟正黑體"/>
@@ -2097,7 +1829,6 @@
               </w:rPr>
               <w:t>規則</w:t>
             </w:r>
-            <w:proofErr w:type="spellEnd"/>
           </w:p>
         </w:tc>
       </w:tr>
@@ -2133,17 +1864,8 @@
                 <w:rFonts w:ascii="微軟正黑體" w:eastAsia="微軟正黑體" w:hAnsi="微軟正黑體"/>
                 <w:sz w:val="17"/>
               </w:rPr>
-              <w:t xml:space="preserve">Working Source of </w:t>
+              <w:t>Working Source of Truth｜工作中的唯一基準</w:t>
             </w:r>
-            <w:proofErr w:type="spellStart"/>
-            <w:r>
-              <w:rPr>
-                <w:rFonts w:ascii="微軟正黑體" w:eastAsia="微軟正黑體" w:hAnsi="微軟正黑體"/>
-                <w:sz w:val="17"/>
-              </w:rPr>
-              <w:t>Truth｜工作中的唯一基準</w:t>
-            </w:r>
-            <w:proofErr w:type="spellEnd"/>
           </w:p>
         </w:tc>
         <w:tc>
@@ -2158,23 +1880,7 @@
                 <w:rFonts w:ascii="微軟正黑體" w:eastAsia="微軟正黑體" w:hAnsi="微軟正黑體"/>
                 <w:sz w:val="17"/>
               </w:rPr>
-              <w:t xml:space="preserve">docs/LOHAShare_AI_Platform；保存最新工作結構、索引、治理文件、tree.txt、README、Markdown </w:t>
-            </w:r>
-            <w:proofErr w:type="spellStart"/>
-            <w:r>
-              <w:rPr>
-                <w:rFonts w:ascii="微軟正黑體" w:eastAsia="微軟正黑體" w:hAnsi="微軟正黑體"/>
-                <w:sz w:val="17"/>
-              </w:rPr>
-              <w:t>與可版本控管的</w:t>
-            </w:r>
-            <w:proofErr w:type="spellEnd"/>
-            <w:r>
-              <w:rPr>
-                <w:rFonts w:ascii="微軟正黑體" w:eastAsia="微軟正黑體" w:hAnsi="微軟正黑體"/>
-                <w:sz w:val="17"/>
-              </w:rPr>
-              <w:t xml:space="preserve"> DOCX。</w:t>
+              <w:t>docs/LOHAShare_AI_Platform；保存最新工作結構、索引、治理文件、tree.txt、README、Markdown 與可版本控管的 DOCX。</w:t>
             </w:r>
           </w:p>
         </w:tc>
@@ -2211,17 +1917,8 @@
                 <w:rFonts w:ascii="微軟正黑體" w:eastAsia="微軟正黑體" w:hAnsi="微軟正黑體"/>
                 <w:sz w:val="17"/>
               </w:rPr>
-              <w:t xml:space="preserve">Formal Archive / Distribution </w:t>
+              <w:t>Formal Archive / Distribution Copy｜正式封存與對外分享副本</w:t>
             </w:r>
-            <w:proofErr w:type="spellStart"/>
-            <w:r>
-              <w:rPr>
-                <w:rFonts w:ascii="微軟正黑體" w:eastAsia="微軟正黑體" w:hAnsi="微軟正黑體"/>
-                <w:sz w:val="17"/>
-              </w:rPr>
-              <w:t>Copy｜正式封存與對外分享副本</w:t>
-            </w:r>
-            <w:proofErr w:type="spellEnd"/>
           </w:p>
         </w:tc>
         <w:tc>
@@ -2279,17 +1976,8 @@
                 <w:rFonts w:ascii="微軟正黑體" w:eastAsia="微軟正黑體" w:hAnsi="微軟正黑體"/>
                 <w:sz w:val="17"/>
               </w:rPr>
-              <w:t xml:space="preserve">Editing </w:t>
+              <w:t>Editing Workspace｜實際編輯工作區</w:t>
             </w:r>
-            <w:proofErr w:type="spellStart"/>
-            <w:r>
-              <w:rPr>
-                <w:rFonts w:ascii="微軟正黑體" w:eastAsia="微軟正黑體" w:hAnsi="微軟正黑體"/>
-                <w:sz w:val="17"/>
-              </w:rPr>
-              <w:t>Workspace｜實際編輯工作區</w:t>
-            </w:r>
-            <w:proofErr w:type="spellEnd"/>
           </w:p>
         </w:tc>
         <w:tc>
@@ -2299,37 +1987,12 @@
             <w:vAlign w:val="center"/>
           </w:tcPr>
           <w:p>
-            <w:proofErr w:type="spellStart"/>
             <w:r>
               <w:rPr>
                 <w:rFonts w:ascii="微軟正黑體" w:eastAsia="微軟正黑體" w:hAnsi="微軟正黑體"/>
                 <w:sz w:val="17"/>
               </w:rPr>
-              <w:t>平時於本機</w:t>
-            </w:r>
-            <w:proofErr w:type="spellEnd"/>
-            <w:r>
-              <w:rPr>
-                <w:rFonts w:ascii="微軟正黑體" w:eastAsia="微軟正黑體" w:hAnsi="微軟正黑體"/>
-                <w:sz w:val="17"/>
-              </w:rPr>
-              <w:t xml:space="preserve"> GitHub Desktop clone </w:t>
-            </w:r>
-            <w:proofErr w:type="spellStart"/>
-            <w:r>
-              <w:rPr>
-                <w:rFonts w:ascii="微軟正黑體" w:eastAsia="微軟正黑體" w:hAnsi="微軟正黑體"/>
-                <w:sz w:val="17"/>
-              </w:rPr>
-              <w:t>資料夾編輯，再</w:t>
-            </w:r>
-            <w:proofErr w:type="spellEnd"/>
-            <w:r>
-              <w:rPr>
-                <w:rFonts w:ascii="微軟正黑體" w:eastAsia="微軟正黑體" w:hAnsi="微軟正黑體"/>
-                <w:sz w:val="17"/>
-              </w:rPr>
-              <w:t xml:space="preserve"> commit / push 到 GitHub。</w:t>
+              <w:t>平時於本機 GitHub Desktop clone 資料夾編輯，再 commit / push 到 GitHub。</w:t>
             </w:r>
           </w:p>
         </w:tc>
@@ -2350,17 +2013,8 @@
                 <w:rFonts w:ascii="微軟正黑體" w:eastAsia="微軟正黑體" w:hAnsi="微軟正黑體"/>
                 <w:sz w:val="17"/>
               </w:rPr>
-              <w:t xml:space="preserve">ChatGPT </w:t>
+              <w:t>ChatGPT 協作</w:t>
             </w:r>
-            <w:proofErr w:type="spellStart"/>
-            <w:r>
-              <w:rPr>
-                <w:rFonts w:ascii="微軟正黑體" w:eastAsia="微軟正黑體" w:hAnsi="微軟正黑體"/>
-                <w:sz w:val="17"/>
-              </w:rPr>
-              <w:t>協作</w:t>
-            </w:r>
-            <w:proofErr w:type="spellEnd"/>
           </w:p>
         </w:tc>
         <w:tc>
@@ -2375,17 +2029,8 @@
                 <w:rFonts w:ascii="微軟正黑體" w:eastAsia="微軟正黑體" w:hAnsi="微軟正黑體"/>
                 <w:sz w:val="17"/>
               </w:rPr>
-              <w:t xml:space="preserve">Review / generation </w:t>
+              <w:t>Review / generation assistant｜規劃、稽核與文件產出協助</w:t>
             </w:r>
-            <w:proofErr w:type="spellStart"/>
-            <w:r>
-              <w:rPr>
-                <w:rFonts w:ascii="微軟正黑體" w:eastAsia="微軟正黑體" w:hAnsi="微軟正黑體"/>
-                <w:sz w:val="17"/>
-              </w:rPr>
-              <w:t>assistant｜規劃、稽核與文件產出協助</w:t>
-            </w:r>
-            <w:proofErr w:type="spellEnd"/>
           </w:p>
         </w:tc>
         <w:tc>
@@ -2436,100 +2081,19 @@
           <w:sz w:val="26"/>
           <w:szCs w:val="26"/>
         </w:rPr>
-        <w:t xml:space="preserve">4. </w:t>
-      </w:r>
-      <w:proofErr w:type="spellStart"/>
-      <w:r>
-        <w:rPr>
-          <w:rFonts w:ascii="Noto Sans TC" w:eastAsia="Noto Sans TC" w:hAnsi="Noto Sans TC"/>
-          <w:color w:val="FF8405"/>
-          <w:sz w:val="26"/>
-          <w:szCs w:val="26"/>
-        </w:rPr>
-        <w:t>為何不建議將</w:t>
-      </w:r>
-      <w:proofErr w:type="spellEnd"/>
-      <w:r>
-        <w:rPr>
-          <w:rFonts w:ascii="Noto Sans TC" w:eastAsia="Noto Sans TC" w:hAnsi="Noto Sans TC"/>
-          <w:color w:val="FF8405"/>
-          <w:sz w:val="26"/>
-          <w:szCs w:val="26"/>
-        </w:rPr>
-        <w:t xml:space="preserve"> GitHub clone </w:t>
-      </w:r>
-      <w:proofErr w:type="spellStart"/>
-      <w:r>
-        <w:rPr>
-          <w:rFonts w:ascii="Noto Sans TC" w:eastAsia="Noto Sans TC" w:hAnsi="Noto Sans TC"/>
-          <w:color w:val="FF8405"/>
-          <w:sz w:val="26"/>
-          <w:szCs w:val="26"/>
-        </w:rPr>
-        <w:t>放進</w:t>
-      </w:r>
-      <w:proofErr w:type="spellEnd"/>
-      <w:r>
-        <w:rPr>
-          <w:rFonts w:ascii="Noto Sans TC" w:eastAsia="Noto Sans TC" w:hAnsi="Noto Sans TC"/>
-          <w:color w:val="FF8405"/>
-          <w:sz w:val="26"/>
-          <w:szCs w:val="26"/>
-        </w:rPr>
-        <w:t xml:space="preserve"> Dropbox</w:t>
+        <w:t>4. 為何不建議將 GitHub clone 放進 Dropbox</w:t>
       </w:r>
     </w:p>
     <w:p>
       <w:pPr>
         <w:pStyle w:val="a0"/>
       </w:pPr>
-      <w:proofErr w:type="spellStart"/>
       <w:r>
         <w:rPr>
           <w:rFonts w:ascii="微軟正黑體" w:eastAsia="微軟正黑體" w:hAnsi="微軟正黑體"/>
           <w:sz w:val="20"/>
         </w:rPr>
-        <w:t>不建議把</w:t>
-      </w:r>
-      <w:proofErr w:type="spellEnd"/>
-      <w:r>
-        <w:rPr>
-          <w:rFonts w:ascii="微軟正黑體" w:eastAsia="微軟正黑體" w:hAnsi="微軟正黑體"/>
-          <w:sz w:val="20"/>
-        </w:rPr>
-        <w:t xml:space="preserve"> GitHub clone </w:t>
-      </w:r>
-      <w:proofErr w:type="spellStart"/>
-      <w:r>
-        <w:rPr>
-          <w:rFonts w:ascii="微軟正黑體" w:eastAsia="微軟正黑體" w:hAnsi="微軟正黑體"/>
-          <w:sz w:val="20"/>
-        </w:rPr>
-        <w:t>資料夾直接放在</w:t>
-      </w:r>
-      <w:proofErr w:type="spellEnd"/>
-      <w:r>
-        <w:rPr>
-          <w:rFonts w:ascii="微軟正黑體" w:eastAsia="微軟正黑體" w:hAnsi="微軟正黑體"/>
-          <w:sz w:val="20"/>
-        </w:rPr>
-        <w:t xml:space="preserve"> Dropbox </w:t>
-      </w:r>
-      <w:proofErr w:type="spellStart"/>
-      <w:r>
-        <w:rPr>
-          <w:rFonts w:ascii="微軟正黑體" w:eastAsia="微軟正黑體" w:hAnsi="微軟正黑體"/>
-          <w:sz w:val="20"/>
-        </w:rPr>
-        <w:t>同步資料夾內</w:t>
-      </w:r>
-      <w:proofErr w:type="spellEnd"/>
-      <w:r>
-        <w:rPr>
-          <w:rFonts w:ascii="微軟正黑體" w:eastAsia="微軟正黑體" w:hAnsi="微軟正黑體"/>
-          <w:sz w:val="20"/>
-        </w:rPr>
-        <w:t>。</w:t>
+        <w:t>不建議把 GitHub clone 資料夾直接放在 Dropbox 同步資料夾內。</w:t>
       </w:r>
     </w:p>
     <w:p>
@@ -2545,25 +2109,7 @@
           <w:sz w:val="20"/>
           <w:lang w:eastAsia="zh-TW"/>
         </w:rPr>
-        <w:t>不要讓 Dropbox 與 Git 同時管理同一</w:t>
-      </w:r>
-      <w:proofErr w:type="gramStart"/>
-      <w:r>
-        <w:rPr>
-          <w:rFonts w:ascii="微軟正黑體" w:eastAsia="微軟正黑體" w:hAnsi="微軟正黑體"/>
-          <w:sz w:val="20"/>
-          <w:lang w:eastAsia="zh-TW"/>
-        </w:rPr>
-        <w:t>個</w:t>
-      </w:r>
-      <w:proofErr w:type="gramEnd"/>
-      <w:r>
-        <w:rPr>
-          <w:rFonts w:ascii="微軟正黑體" w:eastAsia="微軟正黑體" w:hAnsi="微軟正黑體"/>
-          <w:sz w:val="20"/>
-          <w:lang w:eastAsia="zh-TW"/>
-        </w:rPr>
-        <w:t>工作資料夾，以避免 .git 目錄、衝突複本、同步延遲與版本狀態異常。</w:t>
+        <w:t>不要讓 Dropbox 與 Git 同時管理同一個工作資料夾，以避免 .git 目錄、衝突複本、同步延遲與版本狀態異常。</w:t>
       </w:r>
     </w:p>
     <w:p>
@@ -2586,122 +2132,24 @@
       <w:pPr>
         <w:pStyle w:val="a0"/>
       </w:pPr>
-      <w:proofErr w:type="spellStart"/>
       <w:r>
         <w:rPr>
           <w:rFonts w:ascii="微軟正黑體" w:eastAsia="微軟正黑體" w:hAnsi="微軟正黑體"/>
           <w:sz w:val="20"/>
         </w:rPr>
-        <w:t>不要在</w:t>
+        <w:t>不要在 Dropbox 與 GitHub 不一致時直接假設 Dropbox 版本較新；需先比對 GitHub commit、tree.txt 與使用者上傳文件。</w:t>
       </w:r>
-      <w:proofErr w:type="spellEnd"/>
+    </w:p>
+    <w:p>
+      <w:pPr>
+        <w:pStyle w:val="a0"/>
+      </w:pPr>
       <w:r>
         <w:rPr>
           <w:rFonts w:ascii="微軟正黑體" w:eastAsia="微軟正黑體" w:hAnsi="微軟正黑體"/>
           <w:sz w:val="20"/>
         </w:rPr>
-        <w:t xml:space="preserve"> Dropbox 與 GitHub </w:t>
-      </w:r>
-      <w:proofErr w:type="spellStart"/>
-      <w:r>
-        <w:rPr>
-          <w:rFonts w:ascii="微軟正黑體" w:eastAsia="微軟正黑體" w:hAnsi="微軟正黑體"/>
-          <w:sz w:val="20"/>
-        </w:rPr>
-        <w:t>不一致時直接假設</w:t>
-      </w:r>
-      <w:proofErr w:type="spellEnd"/>
-      <w:r>
-        <w:rPr>
-          <w:rFonts w:ascii="微軟正黑體" w:eastAsia="微軟正黑體" w:hAnsi="微軟正黑體"/>
-          <w:sz w:val="20"/>
-        </w:rPr>
-        <w:t xml:space="preserve"> Dropbox </w:t>
-      </w:r>
-      <w:proofErr w:type="spellStart"/>
-      <w:r>
-        <w:rPr>
-          <w:rFonts w:ascii="微軟正黑體" w:eastAsia="微軟正黑體" w:hAnsi="微軟正黑體"/>
-          <w:sz w:val="20"/>
-        </w:rPr>
-        <w:t>版本較新；需先比對</w:t>
-      </w:r>
-      <w:proofErr w:type="spellEnd"/>
-      <w:r>
-        <w:rPr>
-          <w:rFonts w:ascii="微軟正黑體" w:eastAsia="微軟正黑體" w:hAnsi="微軟正黑體"/>
-          <w:sz w:val="20"/>
-        </w:rPr>
-        <w:t xml:space="preserve"> GitHub commit、tree.txt </w:t>
-      </w:r>
-      <w:proofErr w:type="spellStart"/>
-      <w:r>
-        <w:rPr>
-          <w:rFonts w:ascii="微軟正黑體" w:eastAsia="微軟正黑體" w:hAnsi="微軟正黑體"/>
-          <w:sz w:val="20"/>
-        </w:rPr>
-        <w:t>與使用者上傳文件</w:t>
-      </w:r>
-      <w:proofErr w:type="spellEnd"/>
-      <w:r>
-        <w:rPr>
-          <w:rFonts w:ascii="微軟正黑體" w:eastAsia="微軟正黑體" w:hAnsi="微軟正黑體"/>
-          <w:sz w:val="20"/>
-        </w:rPr>
-        <w:t>。</w:t>
-      </w:r>
-    </w:p>
-    <w:p>
-      <w:pPr>
-        <w:pStyle w:val="a0"/>
-      </w:pPr>
-      <w:proofErr w:type="spellStart"/>
-      <w:r>
-        <w:rPr>
-          <w:rFonts w:ascii="微軟正黑體" w:eastAsia="微軟正黑體" w:hAnsi="微軟正黑體"/>
-          <w:sz w:val="20"/>
-        </w:rPr>
-        <w:t>不要將正式封存用</w:t>
-      </w:r>
-      <w:proofErr w:type="spellEnd"/>
-      <w:r>
-        <w:rPr>
-          <w:rFonts w:ascii="微軟正黑體" w:eastAsia="微軟正黑體" w:hAnsi="微軟正黑體"/>
-          <w:sz w:val="20"/>
-        </w:rPr>
-        <w:t xml:space="preserve"> ZIP / PDF / Client Sharing </w:t>
-      </w:r>
-      <w:proofErr w:type="spellStart"/>
-      <w:r>
-        <w:rPr>
-          <w:rFonts w:ascii="微軟正黑體" w:eastAsia="微軟正黑體" w:hAnsi="微軟正黑體"/>
-          <w:sz w:val="20"/>
-        </w:rPr>
-        <w:t>反向覆蓋</w:t>
-      </w:r>
-      <w:proofErr w:type="spellEnd"/>
-      <w:r>
-        <w:rPr>
-          <w:rFonts w:ascii="微軟正黑體" w:eastAsia="微軟正黑體" w:hAnsi="微軟正黑體"/>
-          <w:sz w:val="20"/>
-        </w:rPr>
-        <w:t xml:space="preserve"> GitHub </w:t>
-      </w:r>
-      <w:proofErr w:type="spellStart"/>
-      <w:r>
-        <w:rPr>
-          <w:rFonts w:ascii="微軟正黑體" w:eastAsia="微軟正黑體" w:hAnsi="微軟正黑體"/>
-          <w:sz w:val="20"/>
-        </w:rPr>
-        <w:t>工作區</w:t>
-      </w:r>
-      <w:proofErr w:type="spellEnd"/>
-      <w:r>
-        <w:rPr>
-          <w:rFonts w:ascii="微軟正黑體" w:eastAsia="微軟正黑體" w:hAnsi="微軟正黑體"/>
-          <w:sz w:val="20"/>
-        </w:rPr>
-        <w:t>。</w:t>
+        <w:t>不要將正式封存用 ZIP / PDF / Client Sharing 反向覆蓋 GitHub 工作區。</w:t>
       </w:r>
     </w:p>
     <w:p>
@@ -2721,113 +2169,43 @@
           <w:sz w:val="26"/>
           <w:szCs w:val="26"/>
         </w:rPr>
-        <w:t xml:space="preserve">5. </w:t>
+        <w:t>5. 標準工作流程</w:t>
       </w:r>
-      <w:proofErr w:type="spellStart"/>
-      <w:r>
-        <w:rPr>
-          <w:rFonts w:ascii="Noto Sans TC" w:eastAsia="Noto Sans TC" w:hAnsi="Noto Sans TC"/>
-          <w:color w:val="FF8405"/>
-          <w:sz w:val="26"/>
-          <w:szCs w:val="26"/>
-        </w:rPr>
-        <w:t>標準工作流程</w:t>
-      </w:r>
-      <w:proofErr w:type="spellEnd"/>
     </w:p>
     <w:p>
       <w:pPr>
         <w:pStyle w:val="a"/>
       </w:pPr>
-      <w:proofErr w:type="spellStart"/>
       <w:r>
         <w:rPr>
           <w:rFonts w:ascii="微軟正黑體" w:eastAsia="微軟正黑體" w:hAnsi="微軟正黑體"/>
           <w:sz w:val="20"/>
         </w:rPr>
-        <w:t>平時編輯：在</w:t>
+        <w:t>平時編輯：在 Local PC 的 GitHub Desktop clone 資料夾中工作。</w:t>
       </w:r>
-      <w:proofErr w:type="spellEnd"/>
+    </w:p>
+    <w:p>
+      <w:pPr>
+        <w:pStyle w:val="a"/>
+      </w:pPr>
       <w:r>
         <w:rPr>
           <w:rFonts w:ascii="微軟正黑體" w:eastAsia="微軟正黑體" w:hAnsi="微軟正黑體"/>
           <w:sz w:val="20"/>
         </w:rPr>
-        <w:t xml:space="preserve"> Local PC 的 GitHub Desktop clone </w:t>
+        <w:t>版本控管：修改完成後先 commit，再 push 到 GitHub。</w:t>
       </w:r>
-      <w:proofErr w:type="spellStart"/>
+    </w:p>
+    <w:p>
+      <w:pPr>
+        <w:pStyle w:val="a"/>
+      </w:pPr>
       <w:r>
         <w:rPr>
           <w:rFonts w:ascii="微軟正黑體" w:eastAsia="微軟正黑體" w:hAnsi="微軟正黑體"/>
           <w:sz w:val="20"/>
         </w:rPr>
-        <w:t>資料夾中工作</w:t>
-      </w:r>
-      <w:proofErr w:type="spellEnd"/>
-      <w:r>
-        <w:rPr>
-          <w:rFonts w:ascii="微軟正黑體" w:eastAsia="微軟正黑體" w:hAnsi="微軟正黑體"/>
-          <w:sz w:val="20"/>
-        </w:rPr>
-        <w:t>。</w:t>
-      </w:r>
-    </w:p>
-    <w:p>
-      <w:pPr>
-        <w:pStyle w:val="a"/>
-      </w:pPr>
-      <w:proofErr w:type="spellStart"/>
-      <w:r>
-        <w:rPr>
-          <w:rFonts w:ascii="微軟正黑體" w:eastAsia="微軟正黑體" w:hAnsi="微軟正黑體"/>
-          <w:sz w:val="20"/>
-        </w:rPr>
-        <w:t>版本控管：修改完成後先</w:t>
-      </w:r>
-      <w:proofErr w:type="spellEnd"/>
-      <w:r>
-        <w:rPr>
-          <w:rFonts w:ascii="微軟正黑體" w:eastAsia="微軟正黑體" w:hAnsi="微軟正黑體"/>
-          <w:sz w:val="20"/>
-        </w:rPr>
-        <w:t xml:space="preserve"> </w:t>
-      </w:r>
-      <w:proofErr w:type="spellStart"/>
-      <w:r>
-        <w:rPr>
-          <w:rFonts w:ascii="微軟正黑體" w:eastAsia="微軟正黑體" w:hAnsi="微軟正黑體"/>
-          <w:sz w:val="20"/>
-        </w:rPr>
-        <w:t>commit，再</w:t>
-      </w:r>
-      <w:proofErr w:type="spellEnd"/>
-      <w:r>
-        <w:rPr>
-          <w:rFonts w:ascii="微軟正黑體" w:eastAsia="微軟正黑體" w:hAnsi="微軟正黑體"/>
-          <w:sz w:val="20"/>
-        </w:rPr>
-        <w:t xml:space="preserve"> push 到 GitHub。</w:t>
-      </w:r>
-    </w:p>
-    <w:p>
-      <w:pPr>
-        <w:pStyle w:val="a"/>
-      </w:pPr>
-      <w:proofErr w:type="spellStart"/>
-      <w:r>
-        <w:rPr>
-          <w:rFonts w:ascii="微軟正黑體" w:eastAsia="微軟正黑體" w:hAnsi="微軟正黑體"/>
-          <w:sz w:val="20"/>
-        </w:rPr>
-        <w:t>結構同步：維護</w:t>
-      </w:r>
-      <w:proofErr w:type="spellEnd"/>
-      <w:r>
-        <w:rPr>
-          <w:rFonts w:ascii="微軟正黑體" w:eastAsia="微軟正黑體" w:hAnsi="微軟正黑體"/>
-          <w:sz w:val="20"/>
-        </w:rPr>
-        <w:t xml:space="preserve"> docs/LOHAShare_AI_Platform/LOHAShare_AI_Platform_folder_tree.txt，作為跨對話快速確認樹狀結構的依據。</w:t>
+        <w:t>結構同步：維護 docs/LOHAShare_AI_Platform/LOHAShare_AI_Platform_folder_tree.txt，作為跨對話快速確認樹狀結構的依據。</w:t>
       </w:r>
     </w:p>
     <w:p>
@@ -2851,53 +2229,12 @@
       <w:pPr>
         <w:pStyle w:val="a"/>
       </w:pPr>
-      <w:proofErr w:type="spellStart"/>
       <w:r>
         <w:rPr>
           <w:rFonts w:ascii="微軟正黑體" w:eastAsia="微軟正黑體" w:hAnsi="微軟正黑體"/>
           <w:sz w:val="20"/>
         </w:rPr>
-        <w:t>協作檢查：與</w:t>
-      </w:r>
-      <w:proofErr w:type="spellEnd"/>
-      <w:r>
-        <w:rPr>
-          <w:rFonts w:ascii="微軟正黑體" w:eastAsia="微軟正黑體" w:hAnsi="微軟正黑體"/>
-          <w:sz w:val="20"/>
-        </w:rPr>
-        <w:t xml:space="preserve"> ChatGPT </w:t>
-      </w:r>
-      <w:proofErr w:type="spellStart"/>
-      <w:r>
-        <w:rPr>
-          <w:rFonts w:ascii="微軟正黑體" w:eastAsia="微軟正黑體" w:hAnsi="微軟正黑體"/>
-          <w:sz w:val="20"/>
-        </w:rPr>
-        <w:t>協作時，優先提供</w:t>
-      </w:r>
-      <w:proofErr w:type="spellEnd"/>
-      <w:r>
-        <w:rPr>
-          <w:rFonts w:ascii="微軟正黑體" w:eastAsia="微軟正黑體" w:hAnsi="微軟正黑體"/>
-          <w:sz w:val="20"/>
-        </w:rPr>
-        <w:t xml:space="preserve"> GitHub URL、tree.txt、00_Index </w:t>
-      </w:r>
-      <w:proofErr w:type="spellStart"/>
-      <w:r>
-        <w:rPr>
-          <w:rFonts w:ascii="微軟正黑體" w:eastAsia="微軟正黑體" w:hAnsi="微軟正黑體"/>
-          <w:sz w:val="20"/>
-        </w:rPr>
-        <w:t>核心文件或直接上傳本次要修訂的檔案</w:t>
-      </w:r>
-      <w:proofErr w:type="spellEnd"/>
-      <w:r>
-        <w:rPr>
-          <w:rFonts w:ascii="微軟正黑體" w:eastAsia="微軟正黑體" w:hAnsi="微軟正黑體"/>
-          <w:sz w:val="20"/>
-        </w:rPr>
-        <w:t>。</w:t>
+        <w:t>協作檢查：與 ChatGPT 協作時，優先提供 GitHub URL、tree.txt、00_Index 核心文件或直接上傳本次要修訂的檔案。</w:t>
       </w:r>
     </w:p>
     <w:p>
@@ -2913,25 +2250,7 @@
           <w:sz w:val="20"/>
           <w:lang w:eastAsia="zh-TW"/>
         </w:rPr>
-        <w:t>差異處理：若 Dropbox 與 GitHub 不一致，預設以 GitHub 作為工作基準；若使用者明確上傳新版文件並說明取代 GitHub，則以該上傳文件為</w:t>
-      </w:r>
-      <w:proofErr w:type="gramStart"/>
-      <w:r>
-        <w:rPr>
-          <w:rFonts w:ascii="微軟正黑體" w:eastAsia="微軟正黑體" w:hAnsi="微軟正黑體"/>
-          <w:sz w:val="20"/>
-          <w:lang w:eastAsia="zh-TW"/>
-        </w:rPr>
-        <w:t>準</w:t>
-      </w:r>
-      <w:proofErr w:type="gramEnd"/>
-      <w:r>
-        <w:rPr>
-          <w:rFonts w:ascii="微軟正黑體" w:eastAsia="微軟正黑體" w:hAnsi="微軟正黑體"/>
-          <w:sz w:val="20"/>
-          <w:lang w:eastAsia="zh-TW"/>
-        </w:rPr>
-        <w:t>。</w:t>
+        <w:t>差異處理：若 Dropbox 與 GitHub 不一致，預設以 GitHub 作為工作基準；若使用者明確上傳新版文件並說明取代 GitHub，則以該上傳文件為準。</w:t>
       </w:r>
     </w:p>
     <w:p>
@@ -2951,19 +2270,8 @@
           <w:sz w:val="26"/>
           <w:szCs w:val="26"/>
         </w:rPr>
-        <w:t xml:space="preserve">6. </w:t>
+        <w:t>6. 自動化工具遵守規則</w:t>
       </w:r>
-      <w:proofErr w:type="spellStart"/>
-      <w:r>
-        <w:rPr>
-          <w:rFonts w:ascii="Noto Sans TC" w:eastAsia="Noto Sans TC" w:hAnsi="Noto Sans TC"/>
-          <w:color w:val="FF8405"/>
-          <w:sz w:val="26"/>
-          <w:szCs w:val="26"/>
-        </w:rPr>
-        <w:t>自動化工具遵守規則</w:t>
-      </w:r>
-      <w:proofErr w:type="spellEnd"/>
     </w:p>
     <w:tbl>
       <w:tblPr>
@@ -2996,7 +2304,6 @@
             <w:vAlign w:val="center"/>
           </w:tcPr>
           <w:p>
-            <w:proofErr w:type="spellStart"/>
             <w:r>
               <w:rPr>
                 <w:rFonts w:ascii="微軟正黑體" w:eastAsia="微軟正黑體" w:hAnsi="微軟正黑體"/>
@@ -3006,7 +2313,6 @@
               </w:rPr>
               <w:t>工具</w:t>
             </w:r>
-            <w:proofErr w:type="spellEnd"/>
           </w:p>
         </w:tc>
         <w:tc>
@@ -3016,7 +2322,6 @@
             <w:vAlign w:val="center"/>
           </w:tcPr>
           <w:p>
-            <w:proofErr w:type="spellStart"/>
             <w:r>
               <w:rPr>
                 <w:rFonts w:ascii="微軟正黑體" w:eastAsia="微軟正黑體" w:hAnsi="微軟正黑體"/>
@@ -3026,7 +2331,6 @@
               </w:rPr>
               <w:t>應遵守規則</w:t>
             </w:r>
-            <w:proofErr w:type="spellEnd"/>
           </w:p>
         </w:tc>
         <w:tc>
@@ -3036,7 +2340,6 @@
             <w:vAlign w:val="center"/>
           </w:tcPr>
           <w:p>
-            <w:proofErr w:type="spellStart"/>
             <w:r>
               <w:rPr>
                 <w:rFonts w:ascii="微軟正黑體" w:eastAsia="微軟正黑體" w:hAnsi="微軟正黑體"/>
@@ -3046,7 +2349,6 @@
               </w:rPr>
               <w:t>不得做的事</w:t>
             </w:r>
-            <w:proofErr w:type="spellEnd"/>
           </w:p>
         </w:tc>
       </w:tr>
@@ -3082,55 +2384,7 @@
                 <w:rFonts w:ascii="微軟正黑體" w:eastAsia="微軟正黑體" w:hAnsi="微軟正黑體"/>
                 <w:sz w:val="17"/>
               </w:rPr>
-              <w:t>以 GitHub docs/</w:t>
-            </w:r>
-            <w:proofErr w:type="spellStart"/>
-            <w:r>
-              <w:rPr>
-                <w:rFonts w:ascii="微軟正黑體" w:eastAsia="微軟正黑體" w:hAnsi="微軟正黑體"/>
-                <w:sz w:val="17"/>
-              </w:rPr>
-              <w:t>LOHAShare_AI_Platform</w:t>
-            </w:r>
-            <w:proofErr w:type="spellEnd"/>
-            <w:r>
-              <w:rPr>
-                <w:rFonts w:ascii="微軟正黑體" w:eastAsia="微軟正黑體" w:hAnsi="微軟正黑體"/>
-                <w:sz w:val="17"/>
-              </w:rPr>
-              <w:t xml:space="preserve"> </w:t>
-            </w:r>
-            <w:proofErr w:type="spellStart"/>
-            <w:r>
-              <w:rPr>
-                <w:rFonts w:ascii="微軟正黑體" w:eastAsia="微軟正黑體" w:hAnsi="微軟正黑體"/>
-                <w:sz w:val="17"/>
-              </w:rPr>
-              <w:t>為工作基準，產生索引草稿、SupportOps、DocOps</w:t>
-            </w:r>
-            <w:proofErr w:type="spellEnd"/>
-            <w:r>
-              <w:rPr>
-                <w:rFonts w:ascii="微軟正黑體" w:eastAsia="微軟正黑體" w:hAnsi="微軟正黑體"/>
-                <w:sz w:val="17"/>
-              </w:rPr>
-              <w:t xml:space="preserve"> </w:t>
-            </w:r>
-            <w:proofErr w:type="spellStart"/>
-            <w:r>
-              <w:rPr>
-                <w:rFonts w:ascii="微軟正黑體" w:eastAsia="微軟正黑體" w:hAnsi="微軟正黑體"/>
-                <w:sz w:val="17"/>
-              </w:rPr>
-              <w:t>工作流</w:t>
-            </w:r>
-            <w:proofErr w:type="spellEnd"/>
-            <w:r>
-              <w:rPr>
-                <w:rFonts w:ascii="微軟正黑體" w:eastAsia="微軟正黑體" w:hAnsi="微軟正黑體"/>
-                <w:sz w:val="17"/>
-              </w:rPr>
-              <w:t>。</w:t>
+              <w:t>以 GitHub docs/LOHAShare_AI_Platform 為工作基準，產生索引草稿、SupportOps、DocOps 工作流。</w:t>
             </w:r>
           </w:p>
         </w:tc>
@@ -3141,37 +2395,12 @@
             <w:vAlign w:val="center"/>
           </w:tcPr>
           <w:p>
-            <w:proofErr w:type="spellStart"/>
             <w:r>
               <w:rPr>
                 <w:rFonts w:ascii="微軟正黑體" w:eastAsia="微軟正黑體" w:hAnsi="微軟正黑體"/>
                 <w:sz w:val="17"/>
               </w:rPr>
-              <w:t>不得直接把未審核文件推成</w:t>
-            </w:r>
-            <w:proofErr w:type="spellEnd"/>
-            <w:r>
-              <w:rPr>
-                <w:rFonts w:ascii="微軟正黑體" w:eastAsia="微軟正黑體" w:hAnsi="微軟正黑體"/>
-                <w:sz w:val="17"/>
-              </w:rPr>
-              <w:t xml:space="preserve"> </w:t>
-            </w:r>
-            <w:proofErr w:type="spellStart"/>
-            <w:r>
-              <w:rPr>
-                <w:rFonts w:ascii="微軟正黑體" w:eastAsia="微軟正黑體" w:hAnsi="微軟正黑體"/>
-                <w:sz w:val="17"/>
-              </w:rPr>
-              <w:t>Stable；不得自動覆蓋正式文件</w:t>
-            </w:r>
-            <w:proofErr w:type="spellEnd"/>
-            <w:r>
-              <w:rPr>
-                <w:rFonts w:ascii="微軟正黑體" w:eastAsia="微軟正黑體" w:hAnsi="微軟正黑體"/>
-                <w:sz w:val="17"/>
-              </w:rPr>
-              <w:t>。</w:t>
+              <w:t>不得直接把未審核文件推成 Stable；不得自動覆蓋正式文件。</w:t>
             </w:r>
           </w:p>
         </w:tc>
@@ -3187,21 +2416,12 @@
             <w:vAlign w:val="center"/>
           </w:tcPr>
           <w:p>
-            <w:proofErr w:type="spellStart"/>
             <w:r>
               <w:rPr>
                 <w:rFonts w:ascii="微軟正黑體" w:eastAsia="微軟正黑體" w:hAnsi="微軟正黑體"/>
                 <w:sz w:val="17"/>
               </w:rPr>
-              <w:t>Replit</w:t>
-            </w:r>
-            <w:proofErr w:type="spellEnd"/>
-            <w:r>
-              <w:rPr>
-                <w:rFonts w:ascii="微軟正黑體" w:eastAsia="微軟正黑體" w:hAnsi="微軟正黑體"/>
-                <w:sz w:val="17"/>
-              </w:rPr>
-              <w:t xml:space="preserve"> scripts</w:t>
+              <w:t>Replit scripts</w:t>
             </w:r>
           </w:p>
         </w:tc>
@@ -3212,21 +2432,12 @@
             <w:vAlign w:val="center"/>
           </w:tcPr>
           <w:p>
-            <w:proofErr w:type="spellStart"/>
             <w:r>
               <w:rPr>
                 <w:rFonts w:ascii="微軟正黑體" w:eastAsia="微軟正黑體" w:hAnsi="微軟正黑體"/>
                 <w:sz w:val="17"/>
               </w:rPr>
-              <w:t>可產生文件包、tree.txt、索引草稿與轉檔工具，輸出位置需符合</w:t>
-            </w:r>
-            <w:proofErr w:type="spellEnd"/>
-            <w:r>
-              <w:rPr>
-                <w:rFonts w:ascii="微軟正黑體" w:eastAsia="微軟正黑體" w:hAnsi="微軟正黑體"/>
-                <w:sz w:val="17"/>
-              </w:rPr>
-              <w:t xml:space="preserve"> Current Folder Structure。</w:t>
+              <w:t>可產生文件包、tree.txt、索引草稿與轉檔工具，輸出位置需符合 Current Folder Structure。</w:t>
             </w:r>
           </w:p>
         </w:tc>
@@ -3237,53 +2448,12 @@
             <w:vAlign w:val="center"/>
           </w:tcPr>
           <w:p>
-            <w:proofErr w:type="spellStart"/>
             <w:r>
               <w:rPr>
                 <w:rFonts w:ascii="微軟正黑體" w:eastAsia="微軟正黑體" w:hAnsi="微軟正黑體"/>
                 <w:sz w:val="17"/>
               </w:rPr>
-              <w:t>不得建立</w:t>
-            </w:r>
-            <w:proofErr w:type="spellEnd"/>
-            <w:r>
-              <w:rPr>
-                <w:rFonts w:ascii="微軟正黑體" w:eastAsia="微軟正黑體" w:hAnsi="微軟正黑體"/>
-                <w:sz w:val="17"/>
-              </w:rPr>
-              <w:t xml:space="preserve"> </w:t>
-            </w:r>
-            <w:proofErr w:type="spellStart"/>
-            <w:r>
-              <w:rPr>
-                <w:rFonts w:ascii="微軟正黑體" w:eastAsia="微軟正黑體" w:hAnsi="微軟正黑體"/>
-                <w:sz w:val="17"/>
-              </w:rPr>
-              <w:t>LOHAShare_AI_System</w:t>
-            </w:r>
-            <w:proofErr w:type="spellEnd"/>
-            <w:r>
-              <w:rPr>
-                <w:rFonts w:ascii="微軟正黑體" w:eastAsia="微軟正黑體" w:hAnsi="微軟正黑體"/>
-                <w:sz w:val="17"/>
-              </w:rPr>
-              <w:t xml:space="preserve"> </w:t>
-            </w:r>
-            <w:proofErr w:type="spellStart"/>
-            <w:r>
-              <w:rPr>
-                <w:rFonts w:ascii="微軟正黑體" w:eastAsia="微軟正黑體" w:hAnsi="微軟正黑體"/>
-                <w:sz w:val="17"/>
-              </w:rPr>
-              <w:t>或平行主目錄</w:t>
-            </w:r>
-            <w:proofErr w:type="spellEnd"/>
-            <w:r>
-              <w:rPr>
-                <w:rFonts w:ascii="微軟正黑體" w:eastAsia="微軟正黑體" w:hAnsi="微軟正黑體"/>
-                <w:sz w:val="17"/>
-              </w:rPr>
-              <w:t>。</w:t>
+              <w:t>不得建立 LOHAShare_AI_System 或平行主目錄。</w:t>
             </w:r>
           </w:p>
         </w:tc>
@@ -3315,37 +2485,12 @@
             <w:vAlign w:val="center"/>
           </w:tcPr>
           <w:p>
-            <w:proofErr w:type="spellStart"/>
             <w:r>
               <w:rPr>
                 <w:rFonts w:ascii="微軟正黑體" w:eastAsia="微軟正黑體" w:hAnsi="微軟正黑體"/>
                 <w:sz w:val="17"/>
               </w:rPr>
-              <w:t>正本放在</w:t>
-            </w:r>
-            <w:proofErr w:type="spellEnd"/>
-            <w:r>
-              <w:rPr>
-                <w:rFonts w:ascii="微軟正黑體" w:eastAsia="微軟正黑體" w:hAnsi="微軟正黑體"/>
-                <w:sz w:val="17"/>
-              </w:rPr>
-              <w:t xml:space="preserve"> 05_Developer_Prompts，指揮 AI / </w:t>
-            </w:r>
-            <w:proofErr w:type="spellStart"/>
-            <w:r>
-              <w:rPr>
-                <w:rFonts w:ascii="微軟正黑體" w:eastAsia="微軟正黑體" w:hAnsi="微軟正黑體"/>
-                <w:sz w:val="17"/>
-              </w:rPr>
-              <w:t>開發工具，不是執行工具本體</w:t>
-            </w:r>
-            <w:proofErr w:type="spellEnd"/>
-            <w:r>
-              <w:rPr>
-                <w:rFonts w:ascii="微軟正黑體" w:eastAsia="微軟正黑體" w:hAnsi="微軟正黑體"/>
-                <w:sz w:val="17"/>
-              </w:rPr>
-              <w:t>。</w:t>
+              <w:t>正本放在 05_Developer_Prompts，指揮 AI / 開發工具，不是執行工具本體。</w:t>
             </w:r>
           </w:p>
         </w:tc>
@@ -3356,53 +2501,12 @@
             <w:vAlign w:val="center"/>
           </w:tcPr>
           <w:p>
-            <w:proofErr w:type="spellStart"/>
             <w:r>
               <w:rPr>
                 <w:rFonts w:ascii="微軟正黑體" w:eastAsia="微軟正黑體" w:hAnsi="微軟正黑體"/>
                 <w:sz w:val="17"/>
               </w:rPr>
-              <w:t>不得放入</w:t>
-            </w:r>
-            <w:proofErr w:type="spellEnd"/>
-            <w:r>
-              <w:rPr>
-                <w:rFonts w:ascii="微軟正黑體" w:eastAsia="微軟正黑體" w:hAnsi="微軟正黑體"/>
-                <w:sz w:val="17"/>
-              </w:rPr>
-              <w:t xml:space="preserve"> 02_Modules </w:t>
-            </w:r>
-            <w:proofErr w:type="spellStart"/>
-            <w:r>
-              <w:rPr>
-                <w:rFonts w:ascii="微軟正黑體" w:eastAsia="微軟正黑體" w:hAnsi="微軟正黑體"/>
-                <w:sz w:val="17"/>
-              </w:rPr>
-              <w:t>作為</w:t>
-            </w:r>
-            <w:proofErr w:type="spellEnd"/>
-            <w:r>
-              <w:rPr>
-                <w:rFonts w:ascii="微軟正黑體" w:eastAsia="微軟正黑體" w:hAnsi="微軟正黑體"/>
-                <w:sz w:val="17"/>
-              </w:rPr>
-              <w:t xml:space="preserve"> Prompt </w:t>
-            </w:r>
-            <w:proofErr w:type="spellStart"/>
-            <w:r>
-              <w:rPr>
-                <w:rFonts w:ascii="微軟正黑體" w:eastAsia="微軟正黑體" w:hAnsi="微軟正黑體"/>
-                <w:sz w:val="17"/>
-              </w:rPr>
-              <w:t>正本</w:t>
-            </w:r>
-            <w:proofErr w:type="spellEnd"/>
-            <w:r>
-              <w:rPr>
-                <w:rFonts w:ascii="微軟正黑體" w:eastAsia="微軟正黑體" w:hAnsi="微軟正黑體"/>
-                <w:sz w:val="17"/>
-              </w:rPr>
-              <w:t>。</w:t>
+              <w:t>不得放入 02_Modules 作為 Prompt 正本。</w:t>
             </w:r>
           </w:p>
         </w:tc>
@@ -3434,53 +2538,12 @@
             <w:vAlign w:val="center"/>
           </w:tcPr>
           <w:p>
-            <w:proofErr w:type="spellStart"/>
             <w:r>
               <w:rPr>
                 <w:rFonts w:ascii="微軟正黑體" w:eastAsia="微軟正黑體" w:hAnsi="微軟正黑體"/>
                 <w:sz w:val="17"/>
               </w:rPr>
-              <w:t>第二階段用於文件檢查、tree</w:t>
-            </w:r>
-            <w:proofErr w:type="spellEnd"/>
-            <w:r>
-              <w:rPr>
-                <w:rFonts w:ascii="微軟正黑體" w:eastAsia="微軟正黑體" w:hAnsi="微軟正黑體"/>
-                <w:sz w:val="17"/>
-              </w:rPr>
-              <w:t xml:space="preserve"> </w:t>
-            </w:r>
-            <w:proofErr w:type="spellStart"/>
-            <w:r>
-              <w:rPr>
-                <w:rFonts w:ascii="微軟正黑體" w:eastAsia="微軟正黑體" w:hAnsi="微軟正黑體"/>
-                <w:sz w:val="17"/>
-              </w:rPr>
-              <w:t>產生、Release</w:t>
-            </w:r>
-            <w:proofErr w:type="spellEnd"/>
-            <w:r>
-              <w:rPr>
-                <w:rFonts w:ascii="微軟正黑體" w:eastAsia="微軟正黑體" w:hAnsi="微軟正黑體"/>
-                <w:sz w:val="17"/>
-              </w:rPr>
-              <w:t xml:space="preserve"> </w:t>
-            </w:r>
-            <w:proofErr w:type="spellStart"/>
-            <w:r>
-              <w:rPr>
-                <w:rFonts w:ascii="微軟正黑體" w:eastAsia="微軟正黑體" w:hAnsi="微軟正黑體"/>
-                <w:sz w:val="17"/>
-              </w:rPr>
-              <w:t>Notes、部署檢查與</w:t>
-            </w:r>
-            <w:proofErr w:type="spellEnd"/>
-            <w:r>
-              <w:rPr>
-                <w:rFonts w:ascii="微軟正黑體" w:eastAsia="微軟正黑體" w:hAnsi="微軟正黑體"/>
-                <w:sz w:val="17"/>
-              </w:rPr>
-              <w:t xml:space="preserve"> package export。</w:t>
+              <w:t>第二階段用於文件檢查、tree 產生、Release Notes、部署檢查與 package export。</w:t>
             </w:r>
           </w:p>
         </w:tc>
@@ -3534,37 +2597,12 @@
             <w:vAlign w:val="center"/>
           </w:tcPr>
           <w:p>
-            <w:proofErr w:type="spellStart"/>
             <w:r>
               <w:rPr>
                 <w:rFonts w:ascii="微軟正黑體" w:eastAsia="微軟正黑體" w:hAnsi="微軟正黑體"/>
                 <w:sz w:val="17"/>
               </w:rPr>
-              <w:t>接收正式</w:t>
-            </w:r>
-            <w:proofErr w:type="spellEnd"/>
-            <w:r>
-              <w:rPr>
-                <w:rFonts w:ascii="微軟正黑體" w:eastAsia="微軟正黑體" w:hAnsi="微軟正黑體"/>
-                <w:sz w:val="17"/>
-              </w:rPr>
-              <w:t xml:space="preserve"> DOCX / PDF / ZIP / </w:t>
-            </w:r>
-            <w:proofErr w:type="spellStart"/>
-            <w:r>
-              <w:rPr>
-                <w:rFonts w:ascii="微軟正黑體" w:eastAsia="微軟正黑體" w:hAnsi="微軟正黑體"/>
-                <w:sz w:val="17"/>
-              </w:rPr>
-              <w:t>分享副本</w:t>
-            </w:r>
-            <w:proofErr w:type="spellEnd"/>
-            <w:r>
-              <w:rPr>
-                <w:rFonts w:ascii="微軟正黑體" w:eastAsia="微軟正黑體" w:hAnsi="微軟正黑體"/>
-                <w:sz w:val="17"/>
-              </w:rPr>
-              <w:t>。</w:t>
+              <w:t>接收正式 DOCX / PDF / ZIP / 分享副本。</w:t>
             </w:r>
           </w:p>
         </w:tc>
@@ -3575,37 +2613,12 @@
             <w:vAlign w:val="center"/>
           </w:tcPr>
           <w:p>
-            <w:proofErr w:type="spellStart"/>
             <w:r>
               <w:rPr>
                 <w:rFonts w:ascii="微軟正黑體" w:eastAsia="微軟正黑體" w:hAnsi="微軟正黑體"/>
                 <w:sz w:val="17"/>
               </w:rPr>
-              <w:t>不得與</w:t>
-            </w:r>
-            <w:proofErr w:type="spellEnd"/>
-            <w:r>
-              <w:rPr>
-                <w:rFonts w:ascii="微軟正黑體" w:eastAsia="微軟正黑體" w:hAnsi="微軟正黑體"/>
-                <w:sz w:val="17"/>
-              </w:rPr>
-              <w:t xml:space="preserve"> GitHub clone </w:t>
-            </w:r>
-            <w:proofErr w:type="spellStart"/>
-            <w:r>
-              <w:rPr>
-                <w:rFonts w:ascii="微軟正黑體" w:eastAsia="微軟正黑體" w:hAnsi="微軟正黑體"/>
-                <w:sz w:val="17"/>
-              </w:rPr>
-              <w:t>共用同一個工作資料夾</w:t>
-            </w:r>
-            <w:proofErr w:type="spellEnd"/>
-            <w:r>
-              <w:rPr>
-                <w:rFonts w:ascii="微軟正黑體" w:eastAsia="微軟正黑體" w:hAnsi="微軟正黑體"/>
-                <w:sz w:val="17"/>
-              </w:rPr>
-              <w:t>。</w:t>
+              <w:t>不得與 GitHub clone 共用同一個工作資料夾。</w:t>
             </w:r>
           </w:p>
         </w:tc>
@@ -3629,19 +2642,8 @@
           <w:sz w:val="26"/>
           <w:szCs w:val="26"/>
         </w:rPr>
-        <w:t xml:space="preserve">7. </w:t>
+        <w:t>7. 文件狀態規則</w:t>
       </w:r>
-      <w:proofErr w:type="spellStart"/>
-      <w:r>
-        <w:rPr>
-          <w:rFonts w:ascii="Noto Sans TC" w:eastAsia="Noto Sans TC" w:hAnsi="Noto Sans TC"/>
-          <w:color w:val="FF8405"/>
-          <w:sz w:val="26"/>
-          <w:szCs w:val="26"/>
-        </w:rPr>
-        <w:t>文件狀態規則</w:t>
-      </w:r>
-      <w:proofErr w:type="spellEnd"/>
     </w:p>
     <w:tbl>
       <w:tblPr>
@@ -3674,7 +2676,6 @@
             <w:vAlign w:val="center"/>
           </w:tcPr>
           <w:p>
-            <w:proofErr w:type="spellStart"/>
             <w:r>
               <w:rPr>
                 <w:rFonts w:ascii="微軟正黑體" w:eastAsia="微軟正黑體" w:hAnsi="微軟正黑體"/>
@@ -3684,7 +2685,6 @@
               </w:rPr>
               <w:t>狀態</w:t>
             </w:r>
-            <w:proofErr w:type="spellEnd"/>
           </w:p>
         </w:tc>
         <w:tc>
@@ -3694,7 +2694,6 @@
             <w:vAlign w:val="center"/>
           </w:tcPr>
           <w:p>
-            <w:proofErr w:type="spellStart"/>
             <w:r>
               <w:rPr>
                 <w:rFonts w:ascii="微軟正黑體" w:eastAsia="微軟正黑體" w:hAnsi="微軟正黑體"/>
@@ -3704,7 +2703,6 @@
               </w:rPr>
               <w:t>意義</w:t>
             </w:r>
-            <w:proofErr w:type="spellEnd"/>
           </w:p>
         </w:tc>
         <w:tc>
@@ -3714,7 +2712,6 @@
             <w:vAlign w:val="center"/>
           </w:tcPr>
           <w:p>
-            <w:proofErr w:type="spellStart"/>
             <w:r>
               <w:rPr>
                 <w:rFonts w:ascii="微軟正黑體" w:eastAsia="微軟正黑體" w:hAnsi="微軟正黑體"/>
@@ -3724,7 +2721,6 @@
               </w:rPr>
               <w:t>可否作為正式基準</w:t>
             </w:r>
-            <w:proofErr w:type="spellEnd"/>
           </w:p>
         </w:tc>
       </w:tr>
@@ -3760,39 +2756,7 @@
                 <w:rFonts w:ascii="微軟正黑體" w:eastAsia="微軟正黑體" w:hAnsi="微軟正黑體"/>
                 <w:sz w:val="17"/>
               </w:rPr>
-              <w:t xml:space="preserve">由 AI / n8n / scripts / </w:t>
-            </w:r>
-            <w:proofErr w:type="spellStart"/>
-            <w:r>
-              <w:rPr>
-                <w:rFonts w:ascii="微軟正黑體" w:eastAsia="微軟正黑體" w:hAnsi="微軟正黑體"/>
-                <w:sz w:val="17"/>
-              </w:rPr>
-              <w:t>Replit</w:t>
-            </w:r>
-            <w:proofErr w:type="spellEnd"/>
-            <w:r>
-              <w:rPr>
-                <w:rFonts w:ascii="微軟正黑體" w:eastAsia="微軟正黑體" w:hAnsi="微軟正黑體"/>
-                <w:sz w:val="17"/>
-              </w:rPr>
-              <w:t xml:space="preserve"> </w:t>
-            </w:r>
-            <w:proofErr w:type="spellStart"/>
-            <w:r>
-              <w:rPr>
-                <w:rFonts w:ascii="微軟正黑體" w:eastAsia="微軟正黑體" w:hAnsi="微軟正黑體"/>
-                <w:sz w:val="17"/>
-              </w:rPr>
-              <w:t>初步產出</w:t>
-            </w:r>
-            <w:proofErr w:type="spellEnd"/>
-            <w:r>
-              <w:rPr>
-                <w:rFonts w:ascii="微軟正黑體" w:eastAsia="微軟正黑體" w:hAnsi="微軟正黑體"/>
-                <w:sz w:val="17"/>
-              </w:rPr>
-              <w:t>。</w:t>
+              <w:t>由 AI / n8n / scripts / Replit 初步產出。</w:t>
             </w:r>
           </w:p>
         </w:tc>
@@ -3862,7 +2826,6 @@
             <w:vAlign w:val="center"/>
           </w:tcPr>
           <w:p>
-            <w:proofErr w:type="spellStart"/>
             <w:r>
               <w:rPr>
                 <w:rFonts w:ascii="微軟正黑體" w:eastAsia="微軟正黑體" w:hAnsi="微軟正黑體"/>
@@ -3870,7 +2833,6 @@
               </w:rPr>
               <w:t>部分可參考</w:t>
             </w:r>
-            <w:proofErr w:type="spellEnd"/>
           </w:p>
         </w:tc>
       </w:tr>
@@ -3960,21 +2922,12 @@
             <w:vAlign w:val="center"/>
           </w:tcPr>
           <w:p>
-            <w:proofErr w:type="spellStart"/>
             <w:r>
               <w:rPr>
                 <w:rFonts w:ascii="微軟正黑體" w:eastAsia="微軟正黑體" w:hAnsi="微軟正黑體"/>
                 <w:sz w:val="17"/>
               </w:rPr>
-              <w:t>目前正式基準</w:t>
-            </w:r>
-            <w:proofErr w:type="spellEnd"/>
-            <w:r>
-              <w:rPr>
-                <w:rFonts w:ascii="微軟正黑體" w:eastAsia="微軟正黑體" w:hAnsi="微軟正黑體"/>
-                <w:sz w:val="17"/>
-              </w:rPr>
-              <w:t>。</w:t>
+              <w:t>目前正式基準。</w:t>
             </w:r>
           </w:p>
         </w:tc>
@@ -4022,21 +2975,12 @@
             <w:vAlign w:val="center"/>
           </w:tcPr>
           <w:p>
-            <w:proofErr w:type="spellStart"/>
             <w:r>
               <w:rPr>
                 <w:rFonts w:ascii="微軟正黑體" w:eastAsia="微軟正黑體" w:hAnsi="微軟正黑體"/>
                 <w:sz w:val="17"/>
               </w:rPr>
-              <w:t>已被取代或不再使用</w:t>
-            </w:r>
-            <w:proofErr w:type="spellEnd"/>
-            <w:r>
-              <w:rPr>
-                <w:rFonts w:ascii="微軟正黑體" w:eastAsia="微軟正黑體" w:hAnsi="微軟正黑體"/>
-                <w:sz w:val="17"/>
-              </w:rPr>
-              <w:t>。</w:t>
+              <w:t>已被取代或不再使用。</w:t>
             </w:r>
           </w:p>
         </w:tc>
@@ -4076,19 +3020,8 @@
           <w:sz w:val="26"/>
           <w:szCs w:val="26"/>
         </w:rPr>
-        <w:t xml:space="preserve">8. </w:t>
+        <w:t>8. 資料來源優先順序</w:t>
       </w:r>
-      <w:proofErr w:type="spellStart"/>
-      <w:r>
-        <w:rPr>
-          <w:rFonts w:ascii="Noto Sans TC" w:eastAsia="Noto Sans TC" w:hAnsi="Noto Sans TC"/>
-          <w:color w:val="FF8405"/>
-          <w:sz w:val="26"/>
-          <w:szCs w:val="26"/>
-        </w:rPr>
-        <w:t>資料來源優先順序</w:t>
-      </w:r>
-      <w:proofErr w:type="spellEnd"/>
     </w:p>
     <w:tbl>
       <w:tblPr>
@@ -4121,7 +3054,6 @@
             <w:vAlign w:val="center"/>
           </w:tcPr>
           <w:p>
-            <w:proofErr w:type="spellStart"/>
             <w:r>
               <w:rPr>
                 <w:rFonts w:ascii="微軟正黑體" w:eastAsia="微軟正黑體" w:hAnsi="微軟正黑體"/>
@@ -4131,7 +3063,6 @@
               </w:rPr>
               <w:t>優先順序</w:t>
             </w:r>
-            <w:proofErr w:type="spellEnd"/>
           </w:p>
         </w:tc>
         <w:tc>
@@ -4141,7 +3072,6 @@
             <w:vAlign w:val="center"/>
           </w:tcPr>
           <w:p>
-            <w:proofErr w:type="spellStart"/>
             <w:r>
               <w:rPr>
                 <w:rFonts w:ascii="微軟正黑體" w:eastAsia="微軟正黑體" w:hAnsi="微軟正黑體"/>
@@ -4151,7 +3081,6 @@
               </w:rPr>
               <w:t>來源</w:t>
             </w:r>
-            <w:proofErr w:type="spellEnd"/>
           </w:p>
         </w:tc>
         <w:tc>
@@ -4161,7 +3090,6 @@
             <w:vAlign w:val="center"/>
           </w:tcPr>
           <w:p>
-            <w:proofErr w:type="spellStart"/>
             <w:r>
               <w:rPr>
                 <w:rFonts w:ascii="微軟正黑體" w:eastAsia="微軟正黑體" w:hAnsi="微軟正黑體"/>
@@ -4171,7 +3099,6 @@
               </w:rPr>
               <w:t>規則</w:t>
             </w:r>
-            <w:proofErr w:type="spellEnd"/>
           </w:p>
         </w:tc>
       </w:tr>
@@ -4272,17 +3199,8 @@
                 <w:rFonts w:ascii="微軟正黑體" w:eastAsia="微軟正黑體" w:hAnsi="微軟正黑體"/>
                 <w:sz w:val="17"/>
               </w:rPr>
-              <w:t>GitHub docs/</w:t>
+              <w:t>GitHub docs/LOHAShare_AI_Platform</w:t>
             </w:r>
-            <w:proofErr w:type="spellStart"/>
-            <w:r>
-              <w:rPr>
-                <w:rFonts w:ascii="微軟正黑體" w:eastAsia="微軟正黑體" w:hAnsi="微軟正黑體"/>
-                <w:sz w:val="17"/>
-              </w:rPr>
-              <w:t>LOHAShare_AI_Platform</w:t>
-            </w:r>
-            <w:proofErr w:type="spellEnd"/>
           </w:p>
         </w:tc>
         <w:tc>
@@ -4340,17 +3258,8 @@
                 <w:rFonts w:ascii="微軟正黑體" w:eastAsia="微軟正黑體" w:hAnsi="微軟正黑體"/>
                 <w:sz w:val="17"/>
               </w:rPr>
-              <w:t xml:space="preserve">00_Index </w:t>
+              <w:t>00_Index 核心文件</w:t>
             </w:r>
-            <w:proofErr w:type="spellStart"/>
-            <w:r>
-              <w:rPr>
-                <w:rFonts w:ascii="微軟正黑體" w:eastAsia="微軟正黑體" w:hAnsi="微軟正黑體"/>
-                <w:sz w:val="17"/>
-              </w:rPr>
-              <w:t>核心文件</w:t>
-            </w:r>
-            <w:proofErr w:type="spellEnd"/>
           </w:p>
         </w:tc>
         <w:tc>
@@ -4365,39 +3274,7 @@
                 <w:rFonts w:ascii="微軟正黑體" w:eastAsia="微軟正黑體" w:hAnsi="微軟正黑體"/>
                 <w:sz w:val="17"/>
               </w:rPr>
-              <w:t xml:space="preserve">Current Folder </w:t>
-            </w:r>
-            <w:proofErr w:type="spellStart"/>
-            <w:r>
-              <w:rPr>
-                <w:rFonts w:ascii="微軟正黑體" w:eastAsia="微軟正黑體" w:hAnsi="微軟正黑體"/>
-                <w:sz w:val="17"/>
-              </w:rPr>
-              <w:t>Structure、Document</w:t>
-            </w:r>
-            <w:proofErr w:type="spellEnd"/>
-            <w:r>
-              <w:rPr>
-                <w:rFonts w:ascii="微軟正黑體" w:eastAsia="微軟正黑體" w:hAnsi="微軟正黑體"/>
-                <w:sz w:val="17"/>
-              </w:rPr>
-              <w:t xml:space="preserve"> System </w:t>
-            </w:r>
-            <w:proofErr w:type="spellStart"/>
-            <w:r>
-              <w:rPr>
-                <w:rFonts w:ascii="微軟正黑體" w:eastAsia="微軟正黑體" w:hAnsi="微軟正黑體"/>
-                <w:sz w:val="17"/>
-              </w:rPr>
-              <w:t>Index、New</w:t>
-            </w:r>
-            <w:proofErr w:type="spellEnd"/>
-            <w:r>
-              <w:rPr>
-                <w:rFonts w:ascii="微軟正黑體" w:eastAsia="微軟正黑體" w:hAnsi="微軟正黑體"/>
-                <w:sz w:val="17"/>
-              </w:rPr>
-              <w:t xml:space="preserve"> Conversation Handoff。</w:t>
+              <w:t>Current Folder Structure、Document System Index、New Conversation Handoff。</w:t>
             </w:r>
           </w:p>
         </w:tc>
@@ -4440,25 +3317,7 @@
                 <w:sz w:val="17"/>
                 <w:lang w:eastAsia="zh-TW"/>
               </w:rPr>
-              <w:t>本對話已確認的文字、</w:t>
-            </w:r>
-            <w:proofErr w:type="gramStart"/>
-            <w:r>
-              <w:rPr>
-                <w:rFonts w:ascii="微軟正黑體" w:eastAsia="微軟正黑體" w:hAnsi="微軟正黑體"/>
-                <w:sz w:val="17"/>
-                <w:lang w:eastAsia="zh-TW"/>
-              </w:rPr>
-              <w:t>截圖與</w:t>
-            </w:r>
-            <w:proofErr w:type="gramEnd"/>
-            <w:r>
-              <w:rPr>
-                <w:rFonts w:ascii="微軟正黑體" w:eastAsia="微軟正黑體" w:hAnsi="微軟正黑體"/>
-                <w:sz w:val="17"/>
-                <w:lang w:eastAsia="zh-TW"/>
-              </w:rPr>
-              <w:t xml:space="preserve"> GitHub 路徑</w:t>
+              <w:t>本對話已確認的文字、截圖與 GitHub 路徑</w:t>
             </w:r>
           </w:p>
         </w:tc>
@@ -4517,17 +3376,8 @@
                 <w:rFonts w:ascii="微軟正黑體" w:eastAsia="微軟正黑體" w:hAnsi="微軟正黑體"/>
                 <w:sz w:val="17"/>
               </w:rPr>
-              <w:t xml:space="preserve">Dropbox </w:t>
+              <w:t>Dropbox 正式封存副本</w:t>
             </w:r>
-            <w:proofErr w:type="spellStart"/>
-            <w:r>
-              <w:rPr>
-                <w:rFonts w:ascii="微軟正黑體" w:eastAsia="微軟正黑體" w:hAnsi="微軟正黑體"/>
-                <w:sz w:val="17"/>
-              </w:rPr>
-              <w:t>正式封存副本</w:t>
-            </w:r>
-            <w:proofErr w:type="spellEnd"/>
           </w:p>
         </w:tc>
         <w:tc>
@@ -4635,6 +3485,7 @@
           <w:color w:val="FF8405"/>
           <w:sz w:val="26"/>
           <w:szCs w:val="26"/>
+          <w:lang w:eastAsia="zh-TW"/>
         </w:rPr>
       </w:pPr>
       <w:r>
@@ -4643,6 +3494,7 @@
           <w:color w:val="FF8405"/>
           <w:sz w:val="26"/>
           <w:szCs w:val="26"/>
+          <w:lang w:eastAsia="zh-TW"/>
         </w:rPr>
         <w:t>9. 與文件整編計畫的關係</w:t>
       </w:r>
@@ -4655,39 +3507,16 @@
         </w:rPr>
         <w:t>GitHub / Dropbox 雙軌策略屬於治理基礎，不是補丁文件。</w:t>
       </w:r>
-      <w:proofErr w:type="spellStart"/>
       <w:r>
         <w:rPr>
           <w:rFonts w:ascii="微軟正黑體" w:eastAsia="微軟正黑體" w:hAnsi="微軟正黑體"/>
         </w:rPr>
-        <w:t>未來進入</w:t>
-      </w:r>
-      <w:proofErr w:type="spellEnd"/>
-      <w:r>
-        <w:rPr>
-          <w:rFonts w:ascii="微軟正黑體" w:eastAsia="微軟正黑體" w:hAnsi="微軟正黑體"/>
-        </w:rPr>
-        <w:t xml:space="preserve"> v2.0 Clean Version </w:t>
-      </w:r>
-      <w:proofErr w:type="spellStart"/>
-      <w:r>
-        <w:rPr>
-          <w:rFonts w:ascii="微軟正黑體" w:eastAsia="微軟正黑體" w:hAnsi="微軟正黑體"/>
-        </w:rPr>
-        <w:t>整編時，應將本策略整合到正式閱讀版文件中，並將補正歷程保留於</w:t>
-      </w:r>
-      <w:proofErr w:type="spellEnd"/>
-      <w:r>
-        <w:rPr>
-          <w:rFonts w:ascii="微軟正黑體" w:eastAsia="微軟正黑體" w:hAnsi="微軟正黑體"/>
-        </w:rPr>
-        <w:t xml:space="preserve"> Audit and Correction Log。</w:t>
+        <w:t>未來進入 v2.0 Clean Version 整編時，應將本策略整合到正式閱讀版文件中，並將補正歷程保留於 Audit and Correction Log。</w:t>
       </w:r>
     </w:p>
     <w:p>
       <w:pPr>
         <w:rPr>
-          <w:rFonts w:hint="eastAsia"/>
           <w:lang w:eastAsia="zh-TW"/>
         </w:rPr>
       </w:pPr>
@@ -4781,7 +3610,15 @@
       <w:rPr>
         <w:sz w:val="18"/>
       </w:rPr>
-      <w:t>Document Governance and Automation Spec v1.5</w:t>
+      <w:t>Document Governance and Automation Spec v1.</w:t>
+    </w:r>
+    <w:r>
+      <w:rPr>
+        <w:rFonts w:hint="eastAsia"/>
+        <w:sz w:val="18"/>
+        <w:lang w:eastAsia="zh-TW"/>
+      </w:rPr>
+      <w:t>7</w:t>
     </w:r>
   </w:p>
 </w:hdr>

</xml_diff>